<commit_message>
Extraction notes complémentaires (témoins, parrains, ...) et signalement redondance probable événement de type mariage
</commit_message>
<xml_diff>
--- a/doc/NotesNRa8_cas_particuliers.docx
+++ b/doc/NotesNRa8_cas_particuliers.docx
@@ -1015,6 +1015,9 @@
     </w:p>
     <w:p>
       <w:r>
+        <w:rPr>
+          <w:noProof/>
+        </w:rPr>
         <w:lastRenderedPageBreak/>
         <w:drawing>
           <wp:inline distT="0" distB="0" distL="0" distR="0" wp14:anchorId="3743033D" wp14:editId="04D5F883">
@@ -2481,6 +2484,9 @@
     </w:p>
     <w:p>
       <w:r>
+        <w:rPr>
+          <w:noProof/>
+        </w:rPr>
         <w:drawing>
           <wp:inline distT="0" distB="0" distL="0" distR="0" wp14:anchorId="24AA4C3A" wp14:editId="41BFA1EA">
             <wp:extent cx="3331029" cy="1534027"/>
@@ -2531,6 +2537,9 @@
     </w:p>
     <w:p>
       <w:r>
+        <w:rPr>
+          <w:noProof/>
+        </w:rPr>
         <w:drawing>
           <wp:inline distT="0" distB="0" distL="0" distR="0" wp14:anchorId="2BC9A996" wp14:editId="3DF37B4A">
             <wp:extent cx="3639787" cy="1204486"/>
@@ -2582,6 +2591,9 @@
     </w:p>
     <w:p>
       <w:r>
+        <w:rPr>
+          <w:noProof/>
+        </w:rPr>
         <w:drawing>
           <wp:inline distT="0" distB="0" distL="0" distR="0" wp14:anchorId="276927A7" wp14:editId="76C4CBC0">
             <wp:extent cx="8863330" cy="1727200"/>
@@ -3179,9 +3191,2900 @@
     <w:p/>
     <w:p/>
     <w:p/>
+    <w:p>
+      <w:r>
+        <w:t xml:space="preserve">Notes sur union : </w:t>
+      </w:r>
+      <w:r>
+        <w:t xml:space="preserve">elles sont en fait numérotées </w:t>
+      </w:r>
+      <w:r>
+        <w:t>note-wed-1</w:t>
+      </w:r>
+      <w:r>
+        <w:t xml:space="preserve">, </w:t>
+      </w:r>
+      <w:r>
+        <w:t>note-wed-</w:t>
+      </w:r>
+      <w:r>
+        <w:rPr>
+          <w:color w:val="FF0000"/>
+        </w:rPr>
+        <w:t>2</w:t>
+      </w:r>
+      <w:r>
+        <w:t>, …</w:t>
+      </w:r>
+    </w:p>
+    <w:p/>
+    <w:p>
+      <w:hyperlink r:id="rId20" w:history="1">
+        <w:r>
+          <w:rPr>
+            <w:rStyle w:val="Lienhypertexte"/>
+          </w:rPr>
+          <w:t>https://gw.geneanet.org/sh1?lang=fr&amp;p=christianus&amp;n=alexander</w:t>
+        </w:r>
+      </w:hyperlink>
+    </w:p>
+    <w:p>
+      <w:r>
+        <w:rPr>
+          <w:noProof/>
+        </w:rPr>
+        <w:drawing>
+          <wp:inline distT="0" distB="0" distL="0" distR="0" wp14:anchorId="0D4D0474" wp14:editId="6E7B78C5">
+            <wp:extent cx="3527778" cy="3048000"/>
+            <wp:effectExtent l="0" t="0" r="0" b="0"/>
+            <wp:docPr id="1640334343" name="Image 1"/>
+            <wp:cNvGraphicFramePr>
+              <a:graphicFrameLocks xmlns:a="http://schemas.openxmlformats.org/drawingml/2006/main" noChangeAspect="1"/>
+            </wp:cNvGraphicFramePr>
+            <a:graphic xmlns:a="http://schemas.openxmlformats.org/drawingml/2006/main">
+              <a:graphicData uri="http://schemas.openxmlformats.org/drawingml/2006/picture">
+                <pic:pic xmlns:pic="http://schemas.openxmlformats.org/drawingml/2006/picture">
+                  <pic:nvPicPr>
+                    <pic:cNvPr id="1640334343" name=""/>
+                    <pic:cNvPicPr/>
+                  </pic:nvPicPr>
+                  <pic:blipFill>
+                    <a:blip r:embed="rId21"/>
+                    <a:stretch>
+                      <a:fillRect/>
+                    </a:stretch>
+                  </pic:blipFill>
+                  <pic:spPr>
+                    <a:xfrm>
+                      <a:off x="0" y="0"/>
+                      <a:ext cx="3532745" cy="3052292"/>
+                    </a:xfrm>
+                    <a:prstGeom prst="rect">
+                      <a:avLst/>
+                    </a:prstGeom>
+                  </pic:spPr>
+                </pic:pic>
+              </a:graphicData>
+            </a:graphic>
+          </wp:inline>
+        </w:drawing>
+      </w:r>
+    </w:p>
+    <w:p>
+      <w:pPr>
+        <w:pStyle w:val="Listing"/>
+      </w:pPr>
+      <w:r>
+        <w:t>&lt;</w:t>
+      </w:r>
+      <w:proofErr w:type="gramStart"/>
+      <w:r>
+        <w:t>p</w:t>
+      </w:r>
+      <w:proofErr w:type="gramEnd"/>
+      <w:r>
+        <w:t xml:space="preserve"> </w:t>
+      </w:r>
+      <w:proofErr w:type="spellStart"/>
+      <w:r>
+        <w:t>ng</w:t>
+      </w:r>
+      <w:proofErr w:type="spellEnd"/>
+      <w:r>
+        <w:t>-non-</w:t>
+      </w:r>
+      <w:proofErr w:type="spellStart"/>
+      <w:r>
+        <w:t>bindable</w:t>
+      </w:r>
+      <w:proofErr w:type="spellEnd"/>
+      <w:r>
+        <w:t>&gt;</w:t>
+      </w:r>
+    </w:p>
+    <w:p>
+      <w:pPr>
+        <w:pStyle w:val="Listing"/>
+      </w:pPr>
+      <w:r>
+        <w:t>&lt;</w:t>
+      </w:r>
+      <w:proofErr w:type="gramStart"/>
+      <w:r>
+        <w:t>b</w:t>
+      </w:r>
+      <w:proofErr w:type="gramEnd"/>
+      <w:r>
+        <w:t xml:space="preserve">&gt;Union avec Joanna Van </w:t>
+      </w:r>
+      <w:proofErr w:type="spellStart"/>
+      <w:r>
+        <w:t>Doorslaer</w:t>
+      </w:r>
+      <w:proofErr w:type="spellEnd"/>
+      <w:r>
+        <w:t>&lt;/b</w:t>
+      </w:r>
+      <w:proofErr w:type="gramStart"/>
+      <w:r>
+        <w:t>&gt;:</w:t>
+      </w:r>
+      <w:proofErr w:type="gramEnd"/>
+    </w:p>
+    <w:p>
+      <w:pPr>
+        <w:pStyle w:val="Listing"/>
+      </w:pPr>
+      <w:r>
+        <w:t>&lt;</w:t>
+      </w:r>
+      <w:proofErr w:type="spellStart"/>
+      <w:proofErr w:type="gramStart"/>
+      <w:r>
+        <w:t>br</w:t>
+      </w:r>
+      <w:proofErr w:type="spellEnd"/>
+      <w:proofErr w:type="gramEnd"/>
+      <w:r>
+        <w:t>&gt;</w:t>
+      </w:r>
+    </w:p>
+    <w:p>
+      <w:pPr>
+        <w:pStyle w:val="Listing"/>
+      </w:pPr>
+      <w:r>
+        <w:lastRenderedPageBreak/>
+        <w:t>&lt;</w:t>
+      </w:r>
+      <w:proofErr w:type="gramStart"/>
+      <w:r>
+        <w:t>a</w:t>
+      </w:r>
+      <w:proofErr w:type="gramEnd"/>
+      <w:r>
+        <w:t xml:space="preserve"> </w:t>
+      </w:r>
+      <w:proofErr w:type="spellStart"/>
+      <w:r>
+        <w:t>name</w:t>
+      </w:r>
+      <w:proofErr w:type="spellEnd"/>
+      <w:r>
+        <w:t>="</w:t>
+      </w:r>
+      <w:r>
+        <w:rPr>
+          <w:highlight w:val="yellow"/>
+        </w:rPr>
+        <w:t>note-wed-1</w:t>
+      </w:r>
+      <w:r>
+        <w:t>"&gt;&lt;/a&gt;</w:t>
+      </w:r>
+      <w:proofErr w:type="spellStart"/>
+      <w:r>
+        <w:t>Getuigen</w:t>
+      </w:r>
+      <w:proofErr w:type="spellEnd"/>
+      <w:r>
+        <w:t xml:space="preserve"> </w:t>
+      </w:r>
+      <w:proofErr w:type="spellStart"/>
+      <w:r>
+        <w:t>huwelijksakte</w:t>
+      </w:r>
+      <w:proofErr w:type="spellEnd"/>
+      <w:r>
+        <w:t>:&lt;</w:t>
+      </w:r>
+      <w:proofErr w:type="spellStart"/>
+      <w:r>
+        <w:t>br</w:t>
+      </w:r>
+      <w:proofErr w:type="spellEnd"/>
+      <w:r>
+        <w:t>&gt; - Egidius Alexander&lt;</w:t>
+      </w:r>
+      <w:proofErr w:type="spellStart"/>
+      <w:r>
+        <w:t>br</w:t>
+      </w:r>
+      <w:proofErr w:type="spellEnd"/>
+      <w:r>
+        <w:t xml:space="preserve">&gt; - </w:t>
+      </w:r>
+      <w:proofErr w:type="spellStart"/>
+      <w:r>
+        <w:t>Livinus</w:t>
+      </w:r>
+      <w:proofErr w:type="spellEnd"/>
+      <w:r>
+        <w:t xml:space="preserve"> Van </w:t>
+      </w:r>
+      <w:proofErr w:type="gramStart"/>
+      <w:r>
+        <w:t>...?&lt;</w:t>
+      </w:r>
+      <w:proofErr w:type="gramEnd"/>
+      <w:r>
+        <w:t>/p&gt;</w:t>
+      </w:r>
+    </w:p>
+    <w:p>
+      <w:pPr>
+        <w:pStyle w:val="Listing"/>
+      </w:pPr>
+      <w:r>
+        <w:t>&lt;</w:t>
+      </w:r>
+      <w:proofErr w:type="gramStart"/>
+      <w:r>
+        <w:t>p</w:t>
+      </w:r>
+      <w:proofErr w:type="gramEnd"/>
+      <w:r>
+        <w:t xml:space="preserve"> </w:t>
+      </w:r>
+      <w:proofErr w:type="spellStart"/>
+      <w:r>
+        <w:t>ng</w:t>
+      </w:r>
+      <w:proofErr w:type="spellEnd"/>
+      <w:r>
+        <w:t>-non-</w:t>
+      </w:r>
+      <w:proofErr w:type="spellStart"/>
+      <w:r>
+        <w:t>bindable</w:t>
+      </w:r>
+      <w:proofErr w:type="spellEnd"/>
+      <w:r>
+        <w:t>&gt;</w:t>
+      </w:r>
+    </w:p>
+    <w:p>
+      <w:pPr>
+        <w:pStyle w:val="Listing"/>
+      </w:pPr>
+      <w:r>
+        <w:t>&lt;</w:t>
+      </w:r>
+      <w:proofErr w:type="gramStart"/>
+      <w:r>
+        <w:t>b</w:t>
+      </w:r>
+      <w:proofErr w:type="gramEnd"/>
+      <w:r>
+        <w:t>&gt;Union avec Andrea Blanckaert&lt;/b</w:t>
+      </w:r>
+      <w:proofErr w:type="gramStart"/>
+      <w:r>
+        <w:t>&gt;:</w:t>
+      </w:r>
+      <w:proofErr w:type="gramEnd"/>
+    </w:p>
+    <w:p>
+      <w:pPr>
+        <w:pStyle w:val="Listing"/>
+      </w:pPr>
+      <w:r>
+        <w:t>&lt;</w:t>
+      </w:r>
+      <w:proofErr w:type="spellStart"/>
+      <w:proofErr w:type="gramStart"/>
+      <w:r>
+        <w:t>br</w:t>
+      </w:r>
+      <w:proofErr w:type="spellEnd"/>
+      <w:proofErr w:type="gramEnd"/>
+      <w:r>
+        <w:t>&gt;</w:t>
+      </w:r>
+    </w:p>
+    <w:p>
+      <w:pPr>
+        <w:pStyle w:val="Listing"/>
+      </w:pPr>
+      <w:r>
+        <w:t>&lt;</w:t>
+      </w:r>
+      <w:proofErr w:type="gramStart"/>
+      <w:r>
+        <w:t>a</w:t>
+      </w:r>
+      <w:proofErr w:type="gramEnd"/>
+      <w:r>
+        <w:t xml:space="preserve"> </w:t>
+      </w:r>
+      <w:proofErr w:type="spellStart"/>
+      <w:r>
+        <w:t>name</w:t>
+      </w:r>
+      <w:proofErr w:type="spellEnd"/>
+      <w:r>
+        <w:t>="</w:t>
+      </w:r>
+      <w:r>
+        <w:rPr>
+          <w:highlight w:val="yellow"/>
+        </w:rPr>
+        <w:t>note-wed-</w:t>
+      </w:r>
+      <w:r>
+        <w:rPr>
+          <w:b/>
+          <w:bCs/>
+          <w:color w:val="FF0000"/>
+          <w:highlight w:val="yellow"/>
+        </w:rPr>
+        <w:t>2</w:t>
+      </w:r>
+      <w:r>
+        <w:t>"&gt;&lt;/a&gt;</w:t>
+      </w:r>
+      <w:proofErr w:type="spellStart"/>
+      <w:r>
+        <w:t>Getuigen</w:t>
+      </w:r>
+      <w:proofErr w:type="spellEnd"/>
+      <w:r>
+        <w:t xml:space="preserve"> </w:t>
+      </w:r>
+      <w:proofErr w:type="spellStart"/>
+      <w:r>
+        <w:t>huwelijksakte</w:t>
+      </w:r>
+      <w:proofErr w:type="spellEnd"/>
+      <w:r>
+        <w:t>:&lt;</w:t>
+      </w:r>
+      <w:proofErr w:type="spellStart"/>
+      <w:r>
+        <w:t>br</w:t>
+      </w:r>
+      <w:proofErr w:type="spellEnd"/>
+      <w:r>
+        <w:t>&gt; - Egidius Alexander&lt;</w:t>
+      </w:r>
+      <w:proofErr w:type="spellStart"/>
+      <w:r>
+        <w:t>br</w:t>
+      </w:r>
+      <w:proofErr w:type="spellEnd"/>
+      <w:r>
+        <w:t xml:space="preserve">&gt; - </w:t>
+      </w:r>
+      <w:proofErr w:type="spellStart"/>
+      <w:r>
+        <w:t>Livinus</w:t>
+      </w:r>
+      <w:proofErr w:type="spellEnd"/>
+      <w:r>
+        <w:t xml:space="preserve"> Alexander&lt;/p&gt;</w:t>
+      </w:r>
+    </w:p>
+    <w:p>
+      <w:pPr>
+        <w:pStyle w:val="Listing"/>
+      </w:pPr>
+      <w:r>
+        <w:t>&lt;</w:t>
+      </w:r>
+      <w:proofErr w:type="gramStart"/>
+      <w:r>
+        <w:t>p</w:t>
+      </w:r>
+      <w:proofErr w:type="gramEnd"/>
+      <w:r>
+        <w:t xml:space="preserve"> style="</w:t>
+      </w:r>
+      <w:proofErr w:type="spellStart"/>
+      <w:proofErr w:type="gramStart"/>
+      <w:r>
+        <w:t>clear:both</w:t>
+      </w:r>
+      <w:proofErr w:type="spellEnd"/>
+      <w:proofErr w:type="gramEnd"/>
+      <w:r>
+        <w:t xml:space="preserve">; </w:t>
+      </w:r>
+      <w:proofErr w:type="gramStart"/>
+      <w:r>
+        <w:t>margin:0;</w:t>
+      </w:r>
+      <w:proofErr w:type="gramEnd"/>
+      <w:r>
+        <w:t>"&gt;&lt;/p&gt;</w:t>
+      </w:r>
+    </w:p>
+    <w:p/>
+    <w:p/>
+    <w:p>
+      <w:pPr>
+        <w:pStyle w:val="Listing"/>
+      </w:pPr>
+    </w:p>
+    <w:p/>
+    <w:p/>
+    <w:p>
+      <w:r>
+        <w:t>Dans certains cas : les mariages sont aussi dans les événements : exemple :</w:t>
+      </w:r>
+    </w:p>
+    <w:p>
+      <w:hyperlink r:id="rId22" w:history="1">
+        <w:r>
+          <w:rPr>
+            <w:rStyle w:val="Lienhypertexte"/>
+          </w:rPr>
+          <w:t>https://gw.geneanet.org/sh1?lang=fr&amp;p=joanna+martina&amp;n=back</w:t>
+        </w:r>
+      </w:hyperlink>
+    </w:p>
+    <w:p>
+      <w:r>
+        <w:rPr>
+          <w:noProof/>
+        </w:rPr>
+        <w:drawing>
+          <wp:inline distT="0" distB="0" distL="0" distR="0" wp14:anchorId="7C782C9C" wp14:editId="383CD342">
+            <wp:extent cx="4432610" cy="1346200"/>
+            <wp:effectExtent l="0" t="0" r="6350" b="6350"/>
+            <wp:docPr id="1408612910" name="Image 1"/>
+            <wp:cNvGraphicFramePr>
+              <a:graphicFrameLocks xmlns:a="http://schemas.openxmlformats.org/drawingml/2006/main" noChangeAspect="1"/>
+            </wp:cNvGraphicFramePr>
+            <a:graphic xmlns:a="http://schemas.openxmlformats.org/drawingml/2006/main">
+              <a:graphicData uri="http://schemas.openxmlformats.org/drawingml/2006/picture">
+                <pic:pic xmlns:pic="http://schemas.openxmlformats.org/drawingml/2006/picture">
+                  <pic:nvPicPr>
+                    <pic:cNvPr id="1408612910" name=""/>
+                    <pic:cNvPicPr/>
+                  </pic:nvPicPr>
+                  <pic:blipFill>
+                    <a:blip r:embed="rId23"/>
+                    <a:stretch>
+                      <a:fillRect/>
+                    </a:stretch>
+                  </pic:blipFill>
+                  <pic:spPr>
+                    <a:xfrm>
+                      <a:off x="0" y="0"/>
+                      <a:ext cx="4444147" cy="1349704"/>
+                    </a:xfrm>
+                    <a:prstGeom prst="rect">
+                      <a:avLst/>
+                    </a:prstGeom>
+                  </pic:spPr>
+                </pic:pic>
+              </a:graphicData>
+            </a:graphic>
+          </wp:inline>
+        </w:drawing>
+      </w:r>
+    </w:p>
+    <w:p>
+      <w:r>
+        <w:t>…</w:t>
+      </w:r>
+    </w:p>
+    <w:p>
+      <w:r>
+        <w:rPr>
+          <w:noProof/>
+        </w:rPr>
+        <w:drawing>
+          <wp:inline distT="0" distB="0" distL="0" distR="0" wp14:anchorId="08AB9884" wp14:editId="77F3491C">
+            <wp:extent cx="3549650" cy="1080590"/>
+            <wp:effectExtent l="0" t="0" r="0" b="5715"/>
+            <wp:docPr id="1478264595" name="Image 1"/>
+            <wp:cNvGraphicFramePr>
+              <a:graphicFrameLocks xmlns:a="http://schemas.openxmlformats.org/drawingml/2006/main" noChangeAspect="1"/>
+            </wp:cNvGraphicFramePr>
+            <a:graphic xmlns:a="http://schemas.openxmlformats.org/drawingml/2006/main">
+              <a:graphicData uri="http://schemas.openxmlformats.org/drawingml/2006/picture">
+                <pic:pic xmlns:pic="http://schemas.openxmlformats.org/drawingml/2006/picture">
+                  <pic:nvPicPr>
+                    <pic:cNvPr id="1478264595" name=""/>
+                    <pic:cNvPicPr/>
+                  </pic:nvPicPr>
+                  <pic:blipFill>
+                    <a:blip r:embed="rId24"/>
+                    <a:stretch>
+                      <a:fillRect/>
+                    </a:stretch>
+                  </pic:blipFill>
+                  <pic:spPr>
+                    <a:xfrm>
+                      <a:off x="0" y="0"/>
+                      <a:ext cx="3579135" cy="1089566"/>
+                    </a:xfrm>
+                    <a:prstGeom prst="rect">
+                      <a:avLst/>
+                    </a:prstGeom>
+                  </pic:spPr>
+                </pic:pic>
+              </a:graphicData>
+            </a:graphic>
+          </wp:inline>
+        </w:drawing>
+      </w:r>
+    </w:p>
+    <w:p/>
+    <w:p/>
+    <w:p/>
+    <w:p>
+      <w:hyperlink r:id="rId25" w:history="1">
+        <w:r>
+          <w:rPr>
+            <w:rStyle w:val="Lienhypertexte"/>
+          </w:rPr>
+          <w:t>https://gw.geneanet.org/jvo2506?lang=fr&amp;p=andreas&amp;n=van+brussel</w:t>
+        </w:r>
+      </w:hyperlink>
+    </w:p>
+    <w:p>
+      <w:r>
+        <w:rPr>
+          <w:noProof/>
+        </w:rPr>
+        <w:lastRenderedPageBreak/>
+        <w:drawing>
+          <wp:inline distT="0" distB="0" distL="0" distR="0" wp14:anchorId="33765A54" wp14:editId="5698FE2C">
+            <wp:extent cx="3810000" cy="1946169"/>
+            <wp:effectExtent l="0" t="0" r="0" b="0"/>
+            <wp:docPr id="103172364" name="Image 1"/>
+            <wp:cNvGraphicFramePr>
+              <a:graphicFrameLocks xmlns:a="http://schemas.openxmlformats.org/drawingml/2006/main" noChangeAspect="1"/>
+            </wp:cNvGraphicFramePr>
+            <a:graphic xmlns:a="http://schemas.openxmlformats.org/drawingml/2006/main">
+              <a:graphicData uri="http://schemas.openxmlformats.org/drawingml/2006/picture">
+                <pic:pic xmlns:pic="http://schemas.openxmlformats.org/drawingml/2006/picture">
+                  <pic:nvPicPr>
+                    <pic:cNvPr id="103172364" name=""/>
+                    <pic:cNvPicPr/>
+                  </pic:nvPicPr>
+                  <pic:blipFill>
+                    <a:blip r:embed="rId26"/>
+                    <a:stretch>
+                      <a:fillRect/>
+                    </a:stretch>
+                  </pic:blipFill>
+                  <pic:spPr>
+                    <a:xfrm>
+                      <a:off x="0" y="0"/>
+                      <a:ext cx="3818248" cy="1950382"/>
+                    </a:xfrm>
+                    <a:prstGeom prst="rect">
+                      <a:avLst/>
+                    </a:prstGeom>
+                  </pic:spPr>
+                </pic:pic>
+              </a:graphicData>
+            </a:graphic>
+          </wp:inline>
+        </w:drawing>
+      </w:r>
+    </w:p>
+    <w:p>
+      <w:r>
+        <w:t>Evénements mal extraits :</w:t>
+      </w:r>
+    </w:p>
+    <w:p>
+      <w:pPr>
+        <w:pStyle w:val="Paragraphedeliste"/>
+        <w:numPr>
+          <w:ilvl w:val="0"/>
+          <w:numId w:val="7"/>
+        </w:numPr>
+      </w:pPr>
+      <w:proofErr w:type="gramStart"/>
+      <w:r>
+        <w:t>notes</w:t>
+      </w:r>
+      <w:proofErr w:type="gramEnd"/>
+      <w:r>
+        <w:t xml:space="preserve"> sur mariages vues comme vides / redondantes</w:t>
+      </w:r>
+    </w:p>
+    <w:p/>
+    <w:p>
+      <w:pPr>
+        <w:pStyle w:val="Listing"/>
+      </w:pPr>
+      <w:r>
+        <w:t>&lt;</w:t>
+      </w:r>
+      <w:proofErr w:type="gramStart"/>
+      <w:r>
+        <w:t>tr</w:t>
+      </w:r>
+      <w:proofErr w:type="gramEnd"/>
+      <w:r>
+        <w:t>&gt;</w:t>
+      </w:r>
+    </w:p>
+    <w:p>
+      <w:pPr>
+        <w:pStyle w:val="Listing"/>
+      </w:pPr>
+      <w:r>
+        <w:t>&lt;</w:t>
+      </w:r>
+      <w:proofErr w:type="gramStart"/>
+      <w:r>
+        <w:t>td</w:t>
+      </w:r>
+      <w:proofErr w:type="gramEnd"/>
+      <w:r>
+        <w:t xml:space="preserve"> </w:t>
+      </w:r>
+      <w:proofErr w:type="spellStart"/>
+      <w:r>
+        <w:t>valign</w:t>
+      </w:r>
+      <w:proofErr w:type="spellEnd"/>
+      <w:r>
+        <w:t>="top" style="white-</w:t>
+      </w:r>
+      <w:proofErr w:type="spellStart"/>
+      <w:proofErr w:type="gramStart"/>
+      <w:r>
+        <w:t>space</w:t>
+      </w:r>
+      <w:proofErr w:type="spellEnd"/>
+      <w:r>
+        <w:t>:</w:t>
+      </w:r>
+      <w:proofErr w:type="gramEnd"/>
+      <w:r>
+        <w:t xml:space="preserve"> </w:t>
+      </w:r>
+      <w:proofErr w:type="spellStart"/>
+      <w:proofErr w:type="gramStart"/>
+      <w:r>
+        <w:t>nowrap</w:t>
+      </w:r>
+      <w:proofErr w:type="spellEnd"/>
+      <w:r>
+        <w:t>;</w:t>
+      </w:r>
+      <w:proofErr w:type="gramEnd"/>
+      <w:r>
+        <w:t xml:space="preserve">" </w:t>
+      </w:r>
+      <w:proofErr w:type="spellStart"/>
+      <w:r>
+        <w:t>width</w:t>
+      </w:r>
+      <w:proofErr w:type="spellEnd"/>
+      <w:r>
+        <w:t>="1"&gt;</w:t>
+      </w:r>
+    </w:p>
+    <w:p>
+      <w:pPr>
+        <w:pStyle w:val="Listing"/>
+      </w:pPr>
+      <w:r>
+        <w:t>&lt;</w:t>
+      </w:r>
+      <w:proofErr w:type="spellStart"/>
+      <w:proofErr w:type="gramStart"/>
+      <w:r>
+        <w:t>span</w:t>
+      </w:r>
+      <w:proofErr w:type="spellEnd"/>
+      <w:proofErr w:type="gramEnd"/>
+      <w:r>
+        <w:t xml:space="preserve"> class="</w:t>
+      </w:r>
+      <w:proofErr w:type="spellStart"/>
+      <w:r>
+        <w:t>ddate</w:t>
+      </w:r>
+      <w:proofErr w:type="spellEnd"/>
+      <w:r>
+        <w:t xml:space="preserve"> show-for-medium-up"&gt;8 janvier 1717 :&lt;/</w:t>
+      </w:r>
+      <w:proofErr w:type="spellStart"/>
+      <w:r>
+        <w:t>span</w:t>
+      </w:r>
+      <w:proofErr w:type="spellEnd"/>
+      <w:r>
+        <w:t>&gt;</w:t>
+      </w:r>
+    </w:p>
+    <w:p>
+      <w:pPr>
+        <w:pStyle w:val="Listing"/>
+      </w:pPr>
+      <w:r>
+        <w:t>&lt;/td&gt;</w:t>
+      </w:r>
+    </w:p>
+    <w:p>
+      <w:pPr>
+        <w:pStyle w:val="Listing"/>
+      </w:pPr>
+      <w:r>
+        <w:t>&lt;</w:t>
+      </w:r>
+      <w:proofErr w:type="gramStart"/>
+      <w:r>
+        <w:t>td</w:t>
+      </w:r>
+      <w:proofErr w:type="gramEnd"/>
+      <w:r>
+        <w:t xml:space="preserve"> </w:t>
+      </w:r>
+      <w:proofErr w:type="spellStart"/>
+      <w:r>
+        <w:t>valign</w:t>
+      </w:r>
+      <w:proofErr w:type="spellEnd"/>
+      <w:r>
+        <w:t>="top"&gt;</w:t>
+      </w:r>
+    </w:p>
+    <w:p>
+      <w:pPr>
+        <w:pStyle w:val="Listing"/>
+      </w:pPr>
+      <w:r>
+        <w:t>&lt;</w:t>
+      </w:r>
+      <w:proofErr w:type="spellStart"/>
+      <w:proofErr w:type="gramStart"/>
+      <w:r>
+        <w:t>span</w:t>
+      </w:r>
+      <w:proofErr w:type="spellEnd"/>
+      <w:proofErr w:type="gramEnd"/>
+      <w:r>
+        <w:t xml:space="preserve"> class="</w:t>
+      </w:r>
+      <w:proofErr w:type="spellStart"/>
+      <w:r>
+        <w:t>ddate</w:t>
+      </w:r>
+      <w:proofErr w:type="spellEnd"/>
+      <w:r>
+        <w:t xml:space="preserve"> small-12 show-for-</w:t>
+      </w:r>
+      <w:proofErr w:type="spellStart"/>
+      <w:r>
+        <w:t>small</w:t>
+      </w:r>
+      <w:proofErr w:type="spellEnd"/>
+      <w:r>
+        <w:t>-</w:t>
+      </w:r>
+      <w:proofErr w:type="spellStart"/>
+      <w:r>
+        <w:t>only</w:t>
+      </w:r>
+      <w:proofErr w:type="spellEnd"/>
+      <w:r>
+        <w:t>" style="</w:t>
+      </w:r>
+      <w:proofErr w:type="spellStart"/>
+      <w:proofErr w:type="gramStart"/>
+      <w:r>
+        <w:t>float:none</w:t>
+      </w:r>
+      <w:proofErr w:type="spellEnd"/>
+      <w:proofErr w:type="gramEnd"/>
+      <w:r>
+        <w:t>; padding-</w:t>
+      </w:r>
+      <w:proofErr w:type="gramStart"/>
+      <w:r>
+        <w:t>top:</w:t>
+      </w:r>
+      <w:proofErr w:type="gramEnd"/>
+      <w:r>
+        <w:t>5</w:t>
+      </w:r>
+      <w:proofErr w:type="gramStart"/>
+      <w:r>
+        <w:t>px;</w:t>
+      </w:r>
+      <w:proofErr w:type="gramEnd"/>
+      <w:r>
+        <w:t>"&gt;8 janvier 1717 :&lt;/</w:t>
+      </w:r>
+      <w:proofErr w:type="spellStart"/>
+      <w:r>
+        <w:t>span</w:t>
+      </w:r>
+      <w:proofErr w:type="spellEnd"/>
+      <w:r>
+        <w:t>&gt;</w:t>
+      </w:r>
+    </w:p>
+    <w:p>
+      <w:pPr>
+        <w:pStyle w:val="Listing"/>
+      </w:pPr>
+      <w:r>
+        <w:t>&lt;</w:t>
+      </w:r>
+      <w:proofErr w:type="spellStart"/>
+      <w:proofErr w:type="gramStart"/>
+      <w:r>
+        <w:t>span</w:t>
+      </w:r>
+      <w:proofErr w:type="spellEnd"/>
+      <w:proofErr w:type="gramEnd"/>
+      <w:r>
+        <w:t xml:space="preserve"> class="</w:t>
+      </w:r>
+      <w:proofErr w:type="spellStart"/>
+      <w:r>
+        <w:t>nnom</w:t>
+      </w:r>
+      <w:proofErr w:type="spellEnd"/>
+      <w:r>
+        <w:t>"&gt;</w:t>
+      </w:r>
+    </w:p>
+    <w:p>
+      <w:pPr>
+        <w:pStyle w:val="Listing"/>
+      </w:pPr>
+      <w:proofErr w:type="gramStart"/>
+      <w:r>
+        <w:t>Naissance  -</w:t>
+      </w:r>
+      <w:proofErr w:type="gramEnd"/>
+      <w:r>
+        <w:t xml:space="preserve"> </w:t>
+      </w:r>
+      <w:proofErr w:type="spellStart"/>
+      <w:r>
+        <w:t>Zeveneken</w:t>
+      </w:r>
+      <w:proofErr w:type="spellEnd"/>
+      <w:r>
+        <w:t xml:space="preserve"> &lt;/</w:t>
+      </w:r>
+      <w:proofErr w:type="spellStart"/>
+      <w:r>
+        <w:t>span</w:t>
+      </w:r>
+      <w:proofErr w:type="spellEnd"/>
+      <w:r>
+        <w:t>&gt;</w:t>
+      </w:r>
+    </w:p>
+    <w:p>
+      <w:pPr>
+        <w:pStyle w:val="Listing"/>
+      </w:pPr>
+      <w:r>
+        <w:t>&lt;</w:t>
+      </w:r>
+      <w:proofErr w:type="spellStart"/>
+      <w:proofErr w:type="gramStart"/>
+      <w:r>
+        <w:t>br</w:t>
+      </w:r>
+      <w:proofErr w:type="spellEnd"/>
+      <w:proofErr w:type="gramEnd"/>
+      <w:r>
+        <w:t>&gt;</w:t>
+      </w:r>
+    </w:p>
+    <w:p>
+      <w:pPr>
+        <w:pStyle w:val="Listing"/>
+      </w:pPr>
+      <w:r>
+        <w:t>&lt;</w:t>
+      </w:r>
+      <w:proofErr w:type="gramStart"/>
+      <w:r>
+        <w:t>p</w:t>
+      </w:r>
+      <w:proofErr w:type="gramEnd"/>
+      <w:r>
+        <w:t xml:space="preserve"> class="</w:t>
+      </w:r>
+      <w:proofErr w:type="spellStart"/>
+      <w:r>
+        <w:t>ttemoins</w:t>
+      </w:r>
+      <w:proofErr w:type="spellEnd"/>
+      <w:r>
+        <w:t>" style="</w:t>
+      </w:r>
+      <w:proofErr w:type="gramStart"/>
+      <w:r>
+        <w:t>margin:0;</w:t>
+      </w:r>
+      <w:proofErr w:type="gramEnd"/>
+      <w:r>
+        <w:t>"&gt;</w:t>
+      </w:r>
+    </w:p>
+    <w:p>
+      <w:pPr>
+        <w:pStyle w:val="Listing"/>
+      </w:pPr>
+      <w:r>
+        <w:t>&lt;</w:t>
+      </w:r>
+      <w:proofErr w:type="spellStart"/>
+      <w:proofErr w:type="gramStart"/>
+      <w:r>
+        <w:t>span</w:t>
+      </w:r>
+      <w:proofErr w:type="spellEnd"/>
+      <w:proofErr w:type="gramEnd"/>
+      <w:r>
+        <w:t xml:space="preserve"> class="titre"&gt;Autre :&lt;/</w:t>
+      </w:r>
+      <w:proofErr w:type="spellStart"/>
+      <w:r>
+        <w:t>span</w:t>
+      </w:r>
+      <w:proofErr w:type="spellEnd"/>
+      <w:r>
+        <w:t>&gt;</w:t>
+      </w:r>
+    </w:p>
+    <w:p>
+      <w:pPr>
+        <w:pStyle w:val="Listing"/>
+      </w:pPr>
+      <w:r>
+        <w:t>&lt;</w:t>
+      </w:r>
+      <w:proofErr w:type="gramStart"/>
+      <w:r>
+        <w:t>a  href</w:t>
+      </w:r>
+      <w:proofErr w:type="gramEnd"/>
+      <w:r>
+        <w:t>="jvo</w:t>
+      </w:r>
+      <w:proofErr w:type="gramStart"/>
+      <w:r>
+        <w:t>2506?</w:t>
+      </w:r>
+      <w:proofErr w:type="gramEnd"/>
+      <w:r>
+        <w:t>lang=</w:t>
+      </w:r>
+      <w:proofErr w:type="spellStart"/>
+      <w:r>
+        <w:t>fr&amp;iz</w:t>
+      </w:r>
+      <w:proofErr w:type="spellEnd"/>
+      <w:r>
+        <w:t xml:space="preserve">=12&amp;i=2142"&gt;Andreas Van </w:t>
+      </w:r>
+      <w:proofErr w:type="spellStart"/>
+      <w:r>
+        <w:t>Waervelde</w:t>
+      </w:r>
+      <w:proofErr w:type="spellEnd"/>
+      <w:r>
+        <w:t>&lt;/a&gt;, &lt;</w:t>
+      </w:r>
+      <w:proofErr w:type="spellStart"/>
+      <w:r>
+        <w:t>span</w:t>
+      </w:r>
+      <w:proofErr w:type="spellEnd"/>
+      <w:r>
+        <w:t xml:space="preserve"> class="</w:t>
+      </w:r>
+      <w:proofErr w:type="spellStart"/>
+      <w:r>
+        <w:t>nnotes</w:t>
+      </w:r>
+      <w:proofErr w:type="spellEnd"/>
+      <w:r>
+        <w:t>"&gt;</w:t>
+      </w:r>
+      <w:proofErr w:type="spellStart"/>
+      <w:r>
+        <w:t>Dooppeter</w:t>
+      </w:r>
+      <w:proofErr w:type="spellEnd"/>
+      <w:r>
+        <w:t>&lt;/</w:t>
+      </w:r>
+      <w:proofErr w:type="spellStart"/>
+      <w:r>
+        <w:t>span</w:t>
+      </w:r>
+      <w:proofErr w:type="spellEnd"/>
+      <w:r>
+        <w:t>&gt;</w:t>
+      </w:r>
+    </w:p>
+    <w:p>
+      <w:pPr>
+        <w:pStyle w:val="Listing"/>
+      </w:pPr>
+      <w:r>
+        <w:t>&lt;</w:t>
+      </w:r>
+      <w:proofErr w:type="spellStart"/>
+      <w:proofErr w:type="gramStart"/>
+      <w:r>
+        <w:t>br</w:t>
+      </w:r>
+      <w:proofErr w:type="spellEnd"/>
+      <w:proofErr w:type="gramEnd"/>
+      <w:r>
+        <w:t>&gt;</w:t>
+      </w:r>
+    </w:p>
+    <w:p>
+      <w:pPr>
+        <w:pStyle w:val="Listing"/>
+      </w:pPr>
+      <w:r>
+        <w:t>&lt;</w:t>
+      </w:r>
+      <w:proofErr w:type="spellStart"/>
+      <w:proofErr w:type="gramStart"/>
+      <w:r>
+        <w:t>span</w:t>
+      </w:r>
+      <w:proofErr w:type="spellEnd"/>
+      <w:proofErr w:type="gramEnd"/>
+      <w:r>
+        <w:t xml:space="preserve"> class="titre"&gt;Autre :&lt;/</w:t>
+      </w:r>
+      <w:proofErr w:type="spellStart"/>
+      <w:r>
+        <w:t>span</w:t>
+      </w:r>
+      <w:proofErr w:type="spellEnd"/>
+      <w:r>
+        <w:t>&gt;</w:t>
+      </w:r>
+    </w:p>
+    <w:p>
+      <w:pPr>
+        <w:pStyle w:val="Listing"/>
+      </w:pPr>
+      <w:r>
+        <w:t>&lt;</w:t>
+      </w:r>
+      <w:proofErr w:type="gramStart"/>
+      <w:r>
+        <w:t>a  href</w:t>
+      </w:r>
+      <w:proofErr w:type="gramEnd"/>
+      <w:r>
+        <w:t>="jvo</w:t>
+      </w:r>
+      <w:proofErr w:type="gramStart"/>
+      <w:r>
+        <w:t>2506?</w:t>
+      </w:r>
+      <w:proofErr w:type="gramEnd"/>
+      <w:r>
+        <w:t>lang=</w:t>
+      </w:r>
+      <w:proofErr w:type="spellStart"/>
+      <w:r>
+        <w:t>fr&amp;iz</w:t>
+      </w:r>
+      <w:proofErr w:type="spellEnd"/>
+      <w:r>
+        <w:t>=12&amp;p=</w:t>
+      </w:r>
+      <w:proofErr w:type="spellStart"/>
+      <w:r>
+        <w:t>joanna&amp;n</w:t>
+      </w:r>
+      <w:proofErr w:type="spellEnd"/>
+      <w:r>
+        <w:t>=</w:t>
+      </w:r>
+      <w:proofErr w:type="spellStart"/>
+      <w:r>
+        <w:t>buijse</w:t>
+      </w:r>
+      <w:proofErr w:type="spellEnd"/>
+      <w:r>
+        <w:t xml:space="preserve">"&gt;Joanna </w:t>
+      </w:r>
+      <w:proofErr w:type="spellStart"/>
+      <w:r>
+        <w:t>Buijse</w:t>
+      </w:r>
+      <w:proofErr w:type="spellEnd"/>
+      <w:r>
+        <w:t>&lt;/a</w:t>
+      </w:r>
+      <w:proofErr w:type="gramStart"/>
+      <w:r>
+        <w:t>&gt;,  &lt;</w:t>
+      </w:r>
+      <w:proofErr w:type="spellStart"/>
+      <w:proofErr w:type="gramEnd"/>
+      <w:r>
+        <w:t>bdo</w:t>
+      </w:r>
+      <w:proofErr w:type="spellEnd"/>
+      <w:r>
+        <w:t xml:space="preserve"> </w:t>
+      </w:r>
+      <w:proofErr w:type="spellStart"/>
+      <w:r>
+        <w:t>dir</w:t>
+      </w:r>
+      <w:proofErr w:type="spellEnd"/>
+      <w:r>
+        <w:t>="</w:t>
+      </w:r>
+      <w:proofErr w:type="spellStart"/>
+      <w:r>
+        <w:t>ltr</w:t>
+      </w:r>
+      <w:proofErr w:type="spellEnd"/>
+      <w:r>
+        <w:t>"&gt;/1697&lt;/</w:t>
+      </w:r>
+      <w:proofErr w:type="spellStart"/>
+      <w:r>
+        <w:t>bdo</w:t>
+      </w:r>
+      <w:proofErr w:type="spellEnd"/>
+      <w:r>
+        <w:t>&gt;, &lt;</w:t>
+      </w:r>
+      <w:proofErr w:type="spellStart"/>
+      <w:r>
+        <w:t>span</w:t>
+      </w:r>
+      <w:proofErr w:type="spellEnd"/>
+      <w:r>
+        <w:t xml:space="preserve"> class="</w:t>
+      </w:r>
+      <w:proofErr w:type="spellStart"/>
+      <w:r>
+        <w:t>nnotes</w:t>
+      </w:r>
+      <w:proofErr w:type="spellEnd"/>
+      <w:r>
+        <w:t>"&gt;</w:t>
+      </w:r>
+      <w:proofErr w:type="spellStart"/>
+      <w:r>
+        <w:t>Doopmeter</w:t>
+      </w:r>
+      <w:proofErr w:type="spellEnd"/>
+      <w:r>
+        <w:t>&lt;/</w:t>
+      </w:r>
+      <w:proofErr w:type="spellStart"/>
+      <w:r>
+        <w:t>span</w:t>
+      </w:r>
+      <w:proofErr w:type="spellEnd"/>
+      <w:r>
+        <w:t>&gt;</w:t>
+      </w:r>
+    </w:p>
+    <w:p>
+      <w:pPr>
+        <w:pStyle w:val="Listing"/>
+      </w:pPr>
+      <w:r>
+        <w:t>&lt;</w:t>
+      </w:r>
+      <w:proofErr w:type="spellStart"/>
+      <w:proofErr w:type="gramStart"/>
+      <w:r>
+        <w:t>br</w:t>
+      </w:r>
+      <w:proofErr w:type="spellEnd"/>
+      <w:proofErr w:type="gramEnd"/>
+      <w:r>
+        <w:t>&gt;</w:t>
+      </w:r>
+    </w:p>
+    <w:p>
+      <w:pPr>
+        <w:pStyle w:val="Listing"/>
+      </w:pPr>
+      <w:r>
+        <w:t>&lt;/p&gt;</w:t>
+      </w:r>
+    </w:p>
+    <w:p>
+      <w:pPr>
+        <w:pStyle w:val="Listing"/>
+      </w:pPr>
+      <w:r>
+        <w:t>&lt;/td&gt;</w:t>
+      </w:r>
+    </w:p>
+    <w:p>
+      <w:pPr>
+        <w:pStyle w:val="Listing"/>
+      </w:pPr>
+      <w:r>
+        <w:t>&lt;/tr&gt;</w:t>
+      </w:r>
+    </w:p>
+    <w:p>
+      <w:pPr>
+        <w:pStyle w:val="Listing"/>
+      </w:pPr>
+      <w:r>
+        <w:rPr>
+          <w:highlight w:val="cyan"/>
+        </w:rPr>
+        <w:t>&lt;</w:t>
+      </w:r>
+      <w:proofErr w:type="gramStart"/>
+      <w:r>
+        <w:rPr>
+          <w:highlight w:val="cyan"/>
+        </w:rPr>
+        <w:t>tr</w:t>
+      </w:r>
+      <w:proofErr w:type="gramEnd"/>
+      <w:r>
+        <w:rPr>
+          <w:highlight w:val="cyan"/>
+        </w:rPr>
+        <w:t>&gt;</w:t>
+      </w:r>
+    </w:p>
+    <w:p>
+      <w:pPr>
+        <w:pStyle w:val="Listing"/>
+      </w:pPr>
+      <w:r>
+        <w:t>&lt;</w:t>
+      </w:r>
+      <w:proofErr w:type="gramStart"/>
+      <w:r>
+        <w:rPr>
+          <w:highlight w:val="magenta"/>
+        </w:rPr>
+        <w:t>td</w:t>
+      </w:r>
+      <w:proofErr w:type="gramEnd"/>
+      <w:r>
+        <w:t xml:space="preserve"> </w:t>
+      </w:r>
+      <w:proofErr w:type="spellStart"/>
+      <w:r>
+        <w:t>valign</w:t>
+      </w:r>
+      <w:proofErr w:type="spellEnd"/>
+      <w:r>
+        <w:t>="top" style="white-</w:t>
+      </w:r>
+      <w:proofErr w:type="spellStart"/>
+      <w:proofErr w:type="gramStart"/>
+      <w:r>
+        <w:t>space</w:t>
+      </w:r>
+      <w:proofErr w:type="spellEnd"/>
+      <w:r>
+        <w:t>:</w:t>
+      </w:r>
+      <w:proofErr w:type="gramEnd"/>
+      <w:r>
+        <w:t xml:space="preserve"> </w:t>
+      </w:r>
+      <w:proofErr w:type="spellStart"/>
+      <w:proofErr w:type="gramStart"/>
+      <w:r>
+        <w:t>nowrap</w:t>
+      </w:r>
+      <w:proofErr w:type="spellEnd"/>
+      <w:r>
+        <w:t>;</w:t>
+      </w:r>
+      <w:proofErr w:type="gramEnd"/>
+      <w:r>
+        <w:t xml:space="preserve">" </w:t>
+      </w:r>
+      <w:proofErr w:type="spellStart"/>
+      <w:r>
+        <w:t>width</w:t>
+      </w:r>
+      <w:proofErr w:type="spellEnd"/>
+      <w:r>
+        <w:t>="1"&gt;</w:t>
+      </w:r>
+    </w:p>
+    <w:p>
+      <w:pPr>
+        <w:pStyle w:val="Listing"/>
+      </w:pPr>
+      <w:r>
+        <w:t>&lt;</w:t>
+      </w:r>
+      <w:proofErr w:type="spellStart"/>
+      <w:proofErr w:type="gramStart"/>
+      <w:r>
+        <w:t>span</w:t>
+      </w:r>
+      <w:proofErr w:type="spellEnd"/>
+      <w:proofErr w:type="gramEnd"/>
+      <w:r>
+        <w:t xml:space="preserve"> class="</w:t>
+      </w:r>
+      <w:proofErr w:type="spellStart"/>
+      <w:r>
+        <w:t>ddate</w:t>
+      </w:r>
+      <w:proofErr w:type="spellEnd"/>
+      <w:r>
+        <w:t xml:space="preserve"> show-for-medium-up"&gt;9 septembre 1742 :&lt;/</w:t>
+      </w:r>
+      <w:proofErr w:type="spellStart"/>
+      <w:r>
+        <w:t>span</w:t>
+      </w:r>
+      <w:proofErr w:type="spellEnd"/>
+      <w:r>
+        <w:t>&gt;</w:t>
+      </w:r>
+    </w:p>
+    <w:p>
+      <w:pPr>
+        <w:pStyle w:val="Listing"/>
+      </w:pPr>
+      <w:r>
+        <w:t>&lt;/</w:t>
+      </w:r>
+      <w:r>
+        <w:rPr>
+          <w:highlight w:val="magenta"/>
+        </w:rPr>
+        <w:t>td</w:t>
+      </w:r>
+      <w:r>
+        <w:t>&gt;</w:t>
+      </w:r>
+    </w:p>
+    <w:p>
+      <w:pPr>
+        <w:pStyle w:val="Listing"/>
+      </w:pPr>
+      <w:r>
+        <w:t>&lt;</w:t>
+      </w:r>
+      <w:proofErr w:type="gramStart"/>
+      <w:r>
+        <w:rPr>
+          <w:highlight w:val="magenta"/>
+        </w:rPr>
+        <w:t>td</w:t>
+      </w:r>
+      <w:proofErr w:type="gramEnd"/>
+      <w:r>
+        <w:t xml:space="preserve"> </w:t>
+      </w:r>
+      <w:proofErr w:type="spellStart"/>
+      <w:r>
+        <w:t>valign</w:t>
+      </w:r>
+      <w:proofErr w:type="spellEnd"/>
+      <w:r>
+        <w:t>="top"&gt;</w:t>
+      </w:r>
+    </w:p>
+    <w:p>
+      <w:pPr>
+        <w:pStyle w:val="Listing"/>
+      </w:pPr>
+      <w:r>
+        <w:t>&lt;</w:t>
+      </w:r>
+      <w:proofErr w:type="spellStart"/>
+      <w:proofErr w:type="gramStart"/>
+      <w:r>
+        <w:t>span</w:t>
+      </w:r>
+      <w:proofErr w:type="spellEnd"/>
+      <w:proofErr w:type="gramEnd"/>
+      <w:r>
+        <w:t xml:space="preserve"> class="</w:t>
+      </w:r>
+      <w:proofErr w:type="spellStart"/>
+      <w:r>
+        <w:t>ddate</w:t>
+      </w:r>
+      <w:proofErr w:type="spellEnd"/>
+      <w:r>
+        <w:t xml:space="preserve"> small-12 show-for-</w:t>
+      </w:r>
+      <w:proofErr w:type="spellStart"/>
+      <w:r>
+        <w:t>small</w:t>
+      </w:r>
+      <w:proofErr w:type="spellEnd"/>
+      <w:r>
+        <w:t>-</w:t>
+      </w:r>
+      <w:proofErr w:type="spellStart"/>
+      <w:r>
+        <w:t>only</w:t>
+      </w:r>
+      <w:proofErr w:type="spellEnd"/>
+      <w:r>
+        <w:t>" style="</w:t>
+      </w:r>
+      <w:proofErr w:type="spellStart"/>
+      <w:proofErr w:type="gramStart"/>
+      <w:r>
+        <w:t>float:none</w:t>
+      </w:r>
+      <w:proofErr w:type="spellEnd"/>
+      <w:proofErr w:type="gramEnd"/>
+      <w:r>
+        <w:t>; padding-</w:t>
+      </w:r>
+      <w:proofErr w:type="gramStart"/>
+      <w:r>
+        <w:t>top:</w:t>
+      </w:r>
+      <w:proofErr w:type="gramEnd"/>
+      <w:r>
+        <w:t>5</w:t>
+      </w:r>
+      <w:proofErr w:type="gramStart"/>
+      <w:r>
+        <w:t>px;</w:t>
+      </w:r>
+      <w:proofErr w:type="gramEnd"/>
+      <w:r>
+        <w:t>"&gt;9 septembre 1742 :&lt;/</w:t>
+      </w:r>
+      <w:proofErr w:type="spellStart"/>
+      <w:r>
+        <w:t>span</w:t>
+      </w:r>
+      <w:proofErr w:type="spellEnd"/>
+      <w:r>
+        <w:t>&gt;</w:t>
+      </w:r>
+    </w:p>
+    <w:p>
+      <w:pPr>
+        <w:pStyle w:val="Listing"/>
+      </w:pPr>
+      <w:r>
+        <w:t>&lt;</w:t>
+      </w:r>
+      <w:proofErr w:type="spellStart"/>
+      <w:proofErr w:type="gramStart"/>
+      <w:r>
+        <w:t>span</w:t>
+      </w:r>
+      <w:proofErr w:type="spellEnd"/>
+      <w:proofErr w:type="gramEnd"/>
+      <w:r>
+        <w:t xml:space="preserve"> class="</w:t>
+      </w:r>
+      <w:proofErr w:type="spellStart"/>
+      <w:r>
+        <w:t>nnom</w:t>
+      </w:r>
+      <w:proofErr w:type="spellEnd"/>
+      <w:r>
+        <w:t>"&gt;</w:t>
+      </w:r>
+    </w:p>
+    <w:p>
+      <w:pPr>
+        <w:pStyle w:val="Listing"/>
+      </w:pPr>
+      <w:r>
+        <w:rPr>
+          <w:highlight w:val="yellow"/>
+        </w:rPr>
+        <w:t xml:space="preserve">Mariage (avec Joanna Maria Van de </w:t>
+      </w:r>
+      <w:proofErr w:type="spellStart"/>
+      <w:r>
+        <w:rPr>
+          <w:highlight w:val="yellow"/>
+        </w:rPr>
+        <w:t>Suyvel</w:t>
+      </w:r>
+      <w:proofErr w:type="spellEnd"/>
+      <w:r>
+        <w:rPr>
+          <w:highlight w:val="yellow"/>
+        </w:rPr>
+        <w:t xml:space="preserve">) - </w:t>
+      </w:r>
+      <w:proofErr w:type="spellStart"/>
+      <w:r>
+        <w:rPr>
+          <w:highlight w:val="yellow"/>
+        </w:rPr>
+        <w:t>Sinaai</w:t>
+      </w:r>
+      <w:proofErr w:type="spellEnd"/>
+      <w:r>
+        <w:rPr>
+          <w:highlight w:val="yellow"/>
+        </w:rPr>
+        <w:t xml:space="preserve"> &lt;/</w:t>
+      </w:r>
+      <w:proofErr w:type="spellStart"/>
+      <w:r>
+        <w:rPr>
+          <w:highlight w:val="yellow"/>
+        </w:rPr>
+        <w:t>span</w:t>
+      </w:r>
+      <w:proofErr w:type="spellEnd"/>
+      <w:r>
+        <w:rPr>
+          <w:highlight w:val="yellow"/>
+        </w:rPr>
+        <w:t>&gt;</w:t>
+      </w:r>
+    </w:p>
+    <w:p>
+      <w:pPr>
+        <w:pStyle w:val="Listing"/>
+        <w:rPr>
+          <w:highlight w:val="green"/>
+        </w:rPr>
+      </w:pPr>
+      <w:r>
+        <w:rPr>
+          <w:highlight w:val="green"/>
+        </w:rPr>
+        <w:t>&lt;</w:t>
+      </w:r>
+      <w:proofErr w:type="spellStart"/>
+      <w:proofErr w:type="gramStart"/>
+      <w:r>
+        <w:rPr>
+          <w:highlight w:val="green"/>
+        </w:rPr>
+        <w:t>br</w:t>
+      </w:r>
+      <w:proofErr w:type="spellEnd"/>
+      <w:proofErr w:type="gramEnd"/>
+      <w:r>
+        <w:rPr>
+          <w:highlight w:val="green"/>
+        </w:rPr>
+        <w:t>&gt;</w:t>
+      </w:r>
+    </w:p>
+    <w:p>
+      <w:pPr>
+        <w:pStyle w:val="Listing"/>
+        <w:rPr>
+          <w:highlight w:val="green"/>
+        </w:rPr>
+      </w:pPr>
+      <w:r>
+        <w:rPr>
+          <w:highlight w:val="green"/>
+        </w:rPr>
+        <w:t>&lt;</w:t>
+      </w:r>
+      <w:proofErr w:type="gramStart"/>
+      <w:r>
+        <w:rPr>
+          <w:highlight w:val="green"/>
+        </w:rPr>
+        <w:t>p</w:t>
+      </w:r>
+      <w:proofErr w:type="gramEnd"/>
+      <w:r>
+        <w:rPr>
+          <w:highlight w:val="green"/>
+        </w:rPr>
+        <w:t xml:space="preserve"> class="</w:t>
+      </w:r>
+      <w:proofErr w:type="spellStart"/>
+      <w:r>
+        <w:rPr>
+          <w:highlight w:val="green"/>
+        </w:rPr>
+        <w:t>ttemoins</w:t>
+      </w:r>
+      <w:proofErr w:type="spellEnd"/>
+      <w:r>
+        <w:rPr>
+          <w:highlight w:val="green"/>
+        </w:rPr>
+        <w:t>" style="</w:t>
+      </w:r>
+      <w:proofErr w:type="gramStart"/>
+      <w:r>
+        <w:rPr>
+          <w:highlight w:val="green"/>
+        </w:rPr>
+        <w:t>margin:0;</w:t>
+      </w:r>
+      <w:proofErr w:type="gramEnd"/>
+      <w:r>
+        <w:rPr>
+          <w:highlight w:val="green"/>
+        </w:rPr>
+        <w:t>"&gt;</w:t>
+      </w:r>
+    </w:p>
+    <w:p>
+      <w:pPr>
+        <w:pStyle w:val="Listing"/>
+        <w:rPr>
+          <w:highlight w:val="green"/>
+        </w:rPr>
+      </w:pPr>
+      <w:r>
+        <w:rPr>
+          <w:highlight w:val="green"/>
+        </w:rPr>
+        <w:t>&lt;</w:t>
+      </w:r>
+      <w:proofErr w:type="spellStart"/>
+      <w:proofErr w:type="gramStart"/>
+      <w:r>
+        <w:rPr>
+          <w:highlight w:val="green"/>
+        </w:rPr>
+        <w:t>span</w:t>
+      </w:r>
+      <w:proofErr w:type="spellEnd"/>
+      <w:proofErr w:type="gramEnd"/>
+      <w:r>
+        <w:rPr>
+          <w:highlight w:val="green"/>
+        </w:rPr>
+        <w:t xml:space="preserve"> class="titre"&gt;Témoin :&lt;/</w:t>
+      </w:r>
+      <w:proofErr w:type="spellStart"/>
+      <w:r>
+        <w:rPr>
+          <w:highlight w:val="green"/>
+        </w:rPr>
+        <w:t>span</w:t>
+      </w:r>
+      <w:proofErr w:type="spellEnd"/>
+      <w:r>
+        <w:rPr>
+          <w:highlight w:val="green"/>
+        </w:rPr>
+        <w:t>&gt;</w:t>
+      </w:r>
+    </w:p>
+    <w:p>
+      <w:pPr>
+        <w:pStyle w:val="Listing"/>
+        <w:rPr>
+          <w:highlight w:val="green"/>
+        </w:rPr>
+      </w:pPr>
+      <w:r>
+        <w:rPr>
+          <w:highlight w:val="green"/>
+        </w:rPr>
+        <w:t>&lt;</w:t>
+      </w:r>
+      <w:proofErr w:type="gramStart"/>
+      <w:r>
+        <w:rPr>
+          <w:highlight w:val="green"/>
+        </w:rPr>
+        <w:t>a  href</w:t>
+      </w:r>
+      <w:proofErr w:type="gramEnd"/>
+      <w:r>
+        <w:rPr>
+          <w:highlight w:val="green"/>
+        </w:rPr>
+        <w:t>="jvo</w:t>
+      </w:r>
+      <w:proofErr w:type="gramStart"/>
+      <w:r>
+        <w:rPr>
+          <w:highlight w:val="green"/>
+        </w:rPr>
+        <w:t>2506?</w:t>
+      </w:r>
+      <w:proofErr w:type="gramEnd"/>
+      <w:r>
+        <w:rPr>
+          <w:highlight w:val="green"/>
+        </w:rPr>
+        <w:t>lang=</w:t>
+      </w:r>
+      <w:proofErr w:type="spellStart"/>
+      <w:r>
+        <w:rPr>
+          <w:highlight w:val="green"/>
+        </w:rPr>
+        <w:t>fr&amp;iz</w:t>
+      </w:r>
+      <w:proofErr w:type="spellEnd"/>
+      <w:r>
+        <w:rPr>
+          <w:highlight w:val="green"/>
+        </w:rPr>
+        <w:t xml:space="preserve">=12&amp;i=1552"&gt;Petrus </w:t>
+      </w:r>
+      <w:proofErr w:type="spellStart"/>
+      <w:r>
+        <w:rPr>
+          <w:highlight w:val="green"/>
+        </w:rPr>
+        <w:t>Wuytack</w:t>
+      </w:r>
+      <w:proofErr w:type="spellEnd"/>
+      <w:r>
+        <w:rPr>
+          <w:highlight w:val="green"/>
+        </w:rPr>
+        <w:t>&lt;/a&gt;&lt;</w:t>
+      </w:r>
+      <w:proofErr w:type="spellStart"/>
+      <w:r>
+        <w:rPr>
+          <w:highlight w:val="green"/>
+        </w:rPr>
+        <w:t>br</w:t>
+      </w:r>
+      <w:proofErr w:type="spellEnd"/>
+      <w:r>
+        <w:rPr>
+          <w:highlight w:val="green"/>
+        </w:rPr>
+        <w:t>&gt;</w:t>
+      </w:r>
+    </w:p>
+    <w:p>
+      <w:pPr>
+        <w:pStyle w:val="Listing"/>
+        <w:rPr>
+          <w:highlight w:val="green"/>
+        </w:rPr>
+      </w:pPr>
+      <w:r>
+        <w:rPr>
+          <w:highlight w:val="green"/>
+        </w:rPr>
+        <w:t>&lt;</w:t>
+      </w:r>
+      <w:proofErr w:type="spellStart"/>
+      <w:proofErr w:type="gramStart"/>
+      <w:r>
+        <w:rPr>
+          <w:highlight w:val="green"/>
+        </w:rPr>
+        <w:t>span</w:t>
+      </w:r>
+      <w:proofErr w:type="spellEnd"/>
+      <w:proofErr w:type="gramEnd"/>
+      <w:r>
+        <w:rPr>
+          <w:highlight w:val="green"/>
+        </w:rPr>
+        <w:t xml:space="preserve"> class="titre"&gt;Témoin :&lt;/</w:t>
+      </w:r>
+      <w:proofErr w:type="spellStart"/>
+      <w:r>
+        <w:rPr>
+          <w:highlight w:val="green"/>
+        </w:rPr>
+        <w:t>span</w:t>
+      </w:r>
+      <w:proofErr w:type="spellEnd"/>
+      <w:r>
+        <w:rPr>
+          <w:highlight w:val="green"/>
+        </w:rPr>
+        <w:t>&gt;</w:t>
+      </w:r>
+    </w:p>
+    <w:p>
+      <w:pPr>
+        <w:pStyle w:val="Listing"/>
+        <w:rPr>
+          <w:highlight w:val="green"/>
+        </w:rPr>
+      </w:pPr>
+      <w:r>
+        <w:rPr>
+          <w:highlight w:val="green"/>
+        </w:rPr>
+        <w:lastRenderedPageBreak/>
+        <w:t>&lt;</w:t>
+      </w:r>
+      <w:proofErr w:type="gramStart"/>
+      <w:r>
+        <w:rPr>
+          <w:highlight w:val="green"/>
+        </w:rPr>
+        <w:t>a  href</w:t>
+      </w:r>
+      <w:proofErr w:type="gramEnd"/>
+      <w:r>
+        <w:rPr>
+          <w:highlight w:val="green"/>
+        </w:rPr>
+        <w:t>="jvo</w:t>
+      </w:r>
+      <w:proofErr w:type="gramStart"/>
+      <w:r>
+        <w:rPr>
+          <w:highlight w:val="green"/>
+        </w:rPr>
+        <w:t>2506?</w:t>
+      </w:r>
+      <w:proofErr w:type="gramEnd"/>
+      <w:r>
+        <w:rPr>
+          <w:highlight w:val="green"/>
+        </w:rPr>
+        <w:t>lang=</w:t>
+      </w:r>
+      <w:proofErr w:type="spellStart"/>
+      <w:r>
+        <w:rPr>
+          <w:highlight w:val="green"/>
+        </w:rPr>
+        <w:t>fr&amp;iz</w:t>
+      </w:r>
+      <w:proofErr w:type="spellEnd"/>
+      <w:r>
+        <w:rPr>
+          <w:highlight w:val="green"/>
+        </w:rPr>
+        <w:t xml:space="preserve">=12&amp;i=1553"&gt;Joannes Van </w:t>
+      </w:r>
+      <w:proofErr w:type="spellStart"/>
+      <w:r>
+        <w:rPr>
+          <w:highlight w:val="green"/>
+        </w:rPr>
+        <w:t>Waelevelde</w:t>
+      </w:r>
+      <w:proofErr w:type="spellEnd"/>
+      <w:r>
+        <w:rPr>
+          <w:highlight w:val="green"/>
+        </w:rPr>
+        <w:t>&lt;/a&gt;&lt;</w:t>
+      </w:r>
+      <w:proofErr w:type="spellStart"/>
+      <w:r>
+        <w:rPr>
+          <w:highlight w:val="green"/>
+        </w:rPr>
+        <w:t>br</w:t>
+      </w:r>
+      <w:proofErr w:type="spellEnd"/>
+      <w:r>
+        <w:rPr>
+          <w:highlight w:val="green"/>
+        </w:rPr>
+        <w:t>&gt;</w:t>
+      </w:r>
+    </w:p>
+    <w:p>
+      <w:pPr>
+        <w:pStyle w:val="Listing"/>
+      </w:pPr>
+      <w:r>
+        <w:rPr>
+          <w:highlight w:val="green"/>
+        </w:rPr>
+        <w:t>&lt;/p&gt;</w:t>
+      </w:r>
+    </w:p>
+    <w:p>
+      <w:pPr>
+        <w:pStyle w:val="Listing"/>
+      </w:pPr>
+      <w:r>
+        <w:t>&lt;/</w:t>
+      </w:r>
+      <w:r>
+        <w:rPr>
+          <w:highlight w:val="magenta"/>
+        </w:rPr>
+        <w:t>td</w:t>
+      </w:r>
+      <w:r>
+        <w:t>&gt;</w:t>
+      </w:r>
+    </w:p>
+    <w:p>
+      <w:pPr>
+        <w:pStyle w:val="Listing"/>
+      </w:pPr>
+      <w:r>
+        <w:rPr>
+          <w:highlight w:val="cyan"/>
+        </w:rPr>
+        <w:t>&lt;/tr&gt;</w:t>
+      </w:r>
+    </w:p>
+    <w:p>
+      <w:pPr>
+        <w:pStyle w:val="Listing"/>
+      </w:pPr>
+      <w:r>
+        <w:t>&lt;</w:t>
+      </w:r>
+      <w:proofErr w:type="gramStart"/>
+      <w:r>
+        <w:t>tr</w:t>
+      </w:r>
+      <w:proofErr w:type="gramEnd"/>
+      <w:r>
+        <w:t>&gt;</w:t>
+      </w:r>
+    </w:p>
+    <w:p>
+      <w:pPr>
+        <w:pStyle w:val="Listing"/>
+      </w:pPr>
+      <w:r>
+        <w:t>&lt;</w:t>
+      </w:r>
+      <w:proofErr w:type="gramStart"/>
+      <w:r>
+        <w:t>td</w:t>
+      </w:r>
+      <w:proofErr w:type="gramEnd"/>
+      <w:r>
+        <w:t xml:space="preserve"> </w:t>
+      </w:r>
+      <w:proofErr w:type="spellStart"/>
+      <w:r>
+        <w:t>valign</w:t>
+      </w:r>
+      <w:proofErr w:type="spellEnd"/>
+      <w:r>
+        <w:t>="top" style="white-</w:t>
+      </w:r>
+      <w:proofErr w:type="spellStart"/>
+      <w:proofErr w:type="gramStart"/>
+      <w:r>
+        <w:t>space</w:t>
+      </w:r>
+      <w:proofErr w:type="spellEnd"/>
+      <w:r>
+        <w:t>:</w:t>
+      </w:r>
+      <w:proofErr w:type="gramEnd"/>
+      <w:r>
+        <w:t xml:space="preserve"> </w:t>
+      </w:r>
+      <w:proofErr w:type="spellStart"/>
+      <w:proofErr w:type="gramStart"/>
+      <w:r>
+        <w:t>nowrap</w:t>
+      </w:r>
+      <w:proofErr w:type="spellEnd"/>
+      <w:r>
+        <w:t>;</w:t>
+      </w:r>
+      <w:proofErr w:type="gramEnd"/>
+      <w:r>
+        <w:t xml:space="preserve">" </w:t>
+      </w:r>
+      <w:proofErr w:type="spellStart"/>
+      <w:r>
+        <w:t>width</w:t>
+      </w:r>
+      <w:proofErr w:type="spellEnd"/>
+      <w:r>
+        <w:t>="1"&gt;</w:t>
+      </w:r>
+    </w:p>
+    <w:p>
+      <w:pPr>
+        <w:pStyle w:val="Listing"/>
+      </w:pPr>
+      <w:r>
+        <w:t>&lt;</w:t>
+      </w:r>
+      <w:proofErr w:type="spellStart"/>
+      <w:proofErr w:type="gramStart"/>
+      <w:r>
+        <w:t>span</w:t>
+      </w:r>
+      <w:proofErr w:type="spellEnd"/>
+      <w:proofErr w:type="gramEnd"/>
+      <w:r>
+        <w:t xml:space="preserve"> class="</w:t>
+      </w:r>
+      <w:proofErr w:type="spellStart"/>
+      <w:r>
+        <w:t>ddate</w:t>
+      </w:r>
+      <w:proofErr w:type="spellEnd"/>
+      <w:r>
+        <w:t xml:space="preserve"> show-for-medium-up"&gt;24 septembre 1748 :&lt;/</w:t>
+      </w:r>
+      <w:proofErr w:type="spellStart"/>
+      <w:r>
+        <w:t>span</w:t>
+      </w:r>
+      <w:proofErr w:type="spellEnd"/>
+      <w:r>
+        <w:t>&gt;</w:t>
+      </w:r>
+    </w:p>
+    <w:p>
+      <w:pPr>
+        <w:pStyle w:val="Listing"/>
+      </w:pPr>
+      <w:r>
+        <w:t>&lt;/td&gt;</w:t>
+      </w:r>
+    </w:p>
+    <w:p>
+      <w:pPr>
+        <w:pStyle w:val="Listing"/>
+      </w:pPr>
+      <w:r>
+        <w:t>&lt;</w:t>
+      </w:r>
+      <w:proofErr w:type="gramStart"/>
+      <w:r>
+        <w:t>td</w:t>
+      </w:r>
+      <w:proofErr w:type="gramEnd"/>
+      <w:r>
+        <w:t xml:space="preserve"> </w:t>
+      </w:r>
+      <w:proofErr w:type="spellStart"/>
+      <w:r>
+        <w:t>valign</w:t>
+      </w:r>
+      <w:proofErr w:type="spellEnd"/>
+      <w:r>
+        <w:t>="top"&gt;</w:t>
+      </w:r>
+    </w:p>
+    <w:p>
+      <w:pPr>
+        <w:pStyle w:val="Listing"/>
+      </w:pPr>
+      <w:r>
+        <w:t>&lt;</w:t>
+      </w:r>
+      <w:proofErr w:type="spellStart"/>
+      <w:proofErr w:type="gramStart"/>
+      <w:r>
+        <w:t>span</w:t>
+      </w:r>
+      <w:proofErr w:type="spellEnd"/>
+      <w:proofErr w:type="gramEnd"/>
+      <w:r>
+        <w:t xml:space="preserve"> class="</w:t>
+      </w:r>
+      <w:proofErr w:type="spellStart"/>
+      <w:r>
+        <w:t>ddate</w:t>
+      </w:r>
+      <w:proofErr w:type="spellEnd"/>
+      <w:r>
+        <w:t xml:space="preserve"> small-12 show-for-</w:t>
+      </w:r>
+      <w:proofErr w:type="spellStart"/>
+      <w:r>
+        <w:t>small</w:t>
+      </w:r>
+      <w:proofErr w:type="spellEnd"/>
+      <w:r>
+        <w:t>-</w:t>
+      </w:r>
+      <w:proofErr w:type="spellStart"/>
+      <w:r>
+        <w:t>only</w:t>
+      </w:r>
+      <w:proofErr w:type="spellEnd"/>
+      <w:r>
+        <w:t>" style="</w:t>
+      </w:r>
+      <w:proofErr w:type="spellStart"/>
+      <w:proofErr w:type="gramStart"/>
+      <w:r>
+        <w:t>float:none</w:t>
+      </w:r>
+      <w:proofErr w:type="spellEnd"/>
+      <w:proofErr w:type="gramEnd"/>
+      <w:r>
+        <w:t>; padding-</w:t>
+      </w:r>
+      <w:proofErr w:type="gramStart"/>
+      <w:r>
+        <w:t>top:</w:t>
+      </w:r>
+      <w:proofErr w:type="gramEnd"/>
+      <w:r>
+        <w:t>5</w:t>
+      </w:r>
+      <w:proofErr w:type="gramStart"/>
+      <w:r>
+        <w:t>px;</w:t>
+      </w:r>
+      <w:proofErr w:type="gramEnd"/>
+      <w:r>
+        <w:t>"&gt;24 septembre 1748 :&lt;/</w:t>
+      </w:r>
+      <w:proofErr w:type="spellStart"/>
+      <w:r>
+        <w:t>span</w:t>
+      </w:r>
+      <w:proofErr w:type="spellEnd"/>
+      <w:r>
+        <w:t>&gt;</w:t>
+      </w:r>
+    </w:p>
+    <w:p>
+      <w:pPr>
+        <w:pStyle w:val="Listing"/>
+      </w:pPr>
+      <w:r>
+        <w:t>&lt;</w:t>
+      </w:r>
+      <w:proofErr w:type="spellStart"/>
+      <w:proofErr w:type="gramStart"/>
+      <w:r>
+        <w:t>span</w:t>
+      </w:r>
+      <w:proofErr w:type="spellEnd"/>
+      <w:proofErr w:type="gramEnd"/>
+      <w:r>
+        <w:t xml:space="preserve"> class="</w:t>
+      </w:r>
+      <w:proofErr w:type="spellStart"/>
+      <w:r>
+        <w:t>nnom</w:t>
+      </w:r>
+      <w:proofErr w:type="spellEnd"/>
+      <w:r>
+        <w:t>"&gt;</w:t>
+      </w:r>
+    </w:p>
+    <w:p>
+      <w:pPr>
+        <w:pStyle w:val="Listing"/>
+      </w:pPr>
+      <w:r>
+        <w:rPr>
+          <w:highlight w:val="yellow"/>
+        </w:rPr>
+        <w:t xml:space="preserve">Mariage (avec Maria </w:t>
+      </w:r>
+      <w:proofErr w:type="spellStart"/>
+      <w:r>
+        <w:rPr>
+          <w:highlight w:val="yellow"/>
+        </w:rPr>
+        <w:t>Jacoba</w:t>
+      </w:r>
+      <w:proofErr w:type="spellEnd"/>
+      <w:r>
+        <w:rPr>
+          <w:highlight w:val="yellow"/>
+        </w:rPr>
+        <w:t xml:space="preserve"> </w:t>
+      </w:r>
+      <w:proofErr w:type="spellStart"/>
+      <w:r>
+        <w:rPr>
+          <w:highlight w:val="yellow"/>
+        </w:rPr>
+        <w:t>Erseke</w:t>
+      </w:r>
+      <w:proofErr w:type="spellEnd"/>
+      <w:r>
+        <w:rPr>
+          <w:highlight w:val="yellow"/>
+        </w:rPr>
+        <w:t>) - Moerbeke-Waas &lt;/</w:t>
+      </w:r>
+      <w:proofErr w:type="spellStart"/>
+      <w:r>
+        <w:rPr>
+          <w:highlight w:val="yellow"/>
+        </w:rPr>
+        <w:t>span</w:t>
+      </w:r>
+      <w:proofErr w:type="spellEnd"/>
+      <w:r>
+        <w:rPr>
+          <w:highlight w:val="yellow"/>
+        </w:rPr>
+        <w:t>&gt;</w:t>
+      </w:r>
+    </w:p>
+    <w:p>
+      <w:pPr>
+        <w:pStyle w:val="Listing"/>
+      </w:pPr>
+      <w:r>
+        <w:t>&lt;</w:t>
+      </w:r>
+      <w:proofErr w:type="spellStart"/>
+      <w:proofErr w:type="gramStart"/>
+      <w:r>
+        <w:t>br</w:t>
+      </w:r>
+      <w:proofErr w:type="spellEnd"/>
+      <w:proofErr w:type="gramEnd"/>
+      <w:r>
+        <w:t>&gt;</w:t>
+      </w:r>
+    </w:p>
+    <w:p>
+      <w:pPr>
+        <w:pStyle w:val="Listing"/>
+      </w:pPr>
+      <w:r>
+        <w:t>&lt;</w:t>
+      </w:r>
+      <w:proofErr w:type="gramStart"/>
+      <w:r>
+        <w:t>p</w:t>
+      </w:r>
+      <w:proofErr w:type="gramEnd"/>
+      <w:r>
+        <w:t xml:space="preserve"> class="</w:t>
+      </w:r>
+      <w:proofErr w:type="spellStart"/>
+      <w:r>
+        <w:t>ttemoins</w:t>
+      </w:r>
+      <w:proofErr w:type="spellEnd"/>
+      <w:r>
+        <w:t>" style="</w:t>
+      </w:r>
+      <w:proofErr w:type="gramStart"/>
+      <w:r>
+        <w:t>margin:0;</w:t>
+      </w:r>
+      <w:proofErr w:type="gramEnd"/>
+      <w:r>
+        <w:t>"&gt;</w:t>
+      </w:r>
+    </w:p>
+    <w:p>
+      <w:pPr>
+        <w:pStyle w:val="Listing"/>
+      </w:pPr>
+      <w:r>
+        <w:t>&lt;</w:t>
+      </w:r>
+      <w:proofErr w:type="spellStart"/>
+      <w:proofErr w:type="gramStart"/>
+      <w:r>
+        <w:t>span</w:t>
+      </w:r>
+      <w:proofErr w:type="spellEnd"/>
+      <w:proofErr w:type="gramEnd"/>
+      <w:r>
+        <w:t xml:space="preserve"> class="titre"&gt;Témoin :&lt;/</w:t>
+      </w:r>
+      <w:proofErr w:type="spellStart"/>
+      <w:r>
+        <w:t>span</w:t>
+      </w:r>
+      <w:proofErr w:type="spellEnd"/>
+      <w:r>
+        <w:t>&gt;</w:t>
+      </w:r>
+    </w:p>
+    <w:p>
+      <w:pPr>
+        <w:pStyle w:val="Listing"/>
+      </w:pPr>
+      <w:r>
+        <w:t>&lt;</w:t>
+      </w:r>
+      <w:proofErr w:type="gramStart"/>
+      <w:r>
+        <w:t>a  href</w:t>
+      </w:r>
+      <w:proofErr w:type="gramEnd"/>
+      <w:r>
+        <w:t>="jvo</w:t>
+      </w:r>
+      <w:proofErr w:type="gramStart"/>
+      <w:r>
+        <w:t>2506?</w:t>
+      </w:r>
+      <w:proofErr w:type="gramEnd"/>
+      <w:r>
+        <w:t>lang=</w:t>
+      </w:r>
+      <w:proofErr w:type="spellStart"/>
+      <w:r>
+        <w:t>fr&amp;iz</w:t>
+      </w:r>
+      <w:proofErr w:type="spellEnd"/>
+      <w:r>
+        <w:t>=12&amp;p=</w:t>
+      </w:r>
+      <w:proofErr w:type="spellStart"/>
+      <w:r>
+        <w:t>jacobus&amp;n</w:t>
+      </w:r>
+      <w:proofErr w:type="spellEnd"/>
+      <w:r>
+        <w:t>=</w:t>
+      </w:r>
+      <w:proofErr w:type="spellStart"/>
+      <w:r>
+        <w:t>fasseel</w:t>
+      </w:r>
+      <w:proofErr w:type="spellEnd"/>
+      <w:r>
+        <w:t xml:space="preserve">"&gt;Jacobus </w:t>
+      </w:r>
+      <w:proofErr w:type="spellStart"/>
+      <w:r>
+        <w:t>Fasseel</w:t>
+      </w:r>
+      <w:proofErr w:type="spellEnd"/>
+      <w:r>
+        <w:t>&lt;/a</w:t>
+      </w:r>
+      <w:proofErr w:type="gramStart"/>
+      <w:r>
+        <w:t>&gt;,  &lt;</w:t>
+      </w:r>
+      <w:proofErr w:type="spellStart"/>
+      <w:proofErr w:type="gramEnd"/>
+      <w:r>
+        <w:t>bdo</w:t>
+      </w:r>
+      <w:proofErr w:type="spellEnd"/>
+      <w:r>
+        <w:t xml:space="preserve"> </w:t>
+      </w:r>
+      <w:proofErr w:type="spellStart"/>
+      <w:r>
+        <w:t>dir</w:t>
+      </w:r>
+      <w:proofErr w:type="spellEnd"/>
+      <w:r>
+        <w:t>="</w:t>
+      </w:r>
+      <w:proofErr w:type="spellStart"/>
+      <w:r>
+        <w:t>ltr</w:t>
+      </w:r>
+      <w:proofErr w:type="spellEnd"/>
+      <w:r>
+        <w:t>"&gt;</w:t>
+      </w:r>
+      <w:proofErr w:type="gramStart"/>
+      <w:r>
+        <w:t>ca</w:t>
+      </w:r>
+      <w:proofErr w:type="gramEnd"/>
+      <w:r>
+        <w:t xml:space="preserve"> 1671-1749&lt;/</w:t>
+      </w:r>
+      <w:proofErr w:type="spellStart"/>
+      <w:r>
+        <w:t>bdo</w:t>
+      </w:r>
+      <w:proofErr w:type="spellEnd"/>
+      <w:r>
+        <w:t>&gt;, &lt;</w:t>
+      </w:r>
+      <w:proofErr w:type="spellStart"/>
+      <w:r>
+        <w:t>span</w:t>
+      </w:r>
+      <w:proofErr w:type="spellEnd"/>
+      <w:r>
+        <w:t xml:space="preserve"> class="</w:t>
+      </w:r>
+      <w:proofErr w:type="spellStart"/>
+      <w:r>
+        <w:t>nnotes</w:t>
+      </w:r>
+      <w:proofErr w:type="spellEnd"/>
+      <w:r>
+        <w:t>"&gt;</w:t>
+      </w:r>
+      <w:proofErr w:type="spellStart"/>
+      <w:r>
+        <w:t>Voogd</w:t>
+      </w:r>
+      <w:proofErr w:type="spellEnd"/>
+      <w:r>
+        <w:t xml:space="preserve"> van de </w:t>
+      </w:r>
+      <w:proofErr w:type="spellStart"/>
+      <w:r>
+        <w:t>bruid</w:t>
+      </w:r>
+      <w:proofErr w:type="spellEnd"/>
+      <w:r>
+        <w:t>&lt;/</w:t>
+      </w:r>
+      <w:proofErr w:type="spellStart"/>
+      <w:r>
+        <w:t>span</w:t>
+      </w:r>
+      <w:proofErr w:type="spellEnd"/>
+      <w:r>
+        <w:t>&gt;</w:t>
+      </w:r>
+    </w:p>
+    <w:p>
+      <w:pPr>
+        <w:pStyle w:val="Listing"/>
+      </w:pPr>
+      <w:r>
+        <w:t>&lt;</w:t>
+      </w:r>
+      <w:proofErr w:type="spellStart"/>
+      <w:proofErr w:type="gramStart"/>
+      <w:r>
+        <w:t>br</w:t>
+      </w:r>
+      <w:proofErr w:type="spellEnd"/>
+      <w:proofErr w:type="gramEnd"/>
+      <w:r>
+        <w:t>&gt;</w:t>
+      </w:r>
+    </w:p>
+    <w:p>
+      <w:pPr>
+        <w:pStyle w:val="Listing"/>
+      </w:pPr>
+      <w:r>
+        <w:t>&lt;</w:t>
+      </w:r>
+      <w:proofErr w:type="spellStart"/>
+      <w:proofErr w:type="gramStart"/>
+      <w:r>
+        <w:t>span</w:t>
+      </w:r>
+      <w:proofErr w:type="spellEnd"/>
+      <w:proofErr w:type="gramEnd"/>
+      <w:r>
+        <w:t xml:space="preserve"> class="titre"&gt;Témoin :&lt;/</w:t>
+      </w:r>
+      <w:proofErr w:type="spellStart"/>
+      <w:r>
+        <w:t>span</w:t>
+      </w:r>
+      <w:proofErr w:type="spellEnd"/>
+      <w:r>
+        <w:t>&gt;</w:t>
+      </w:r>
+    </w:p>
+    <w:p>
+      <w:pPr>
+        <w:pStyle w:val="Listing"/>
+      </w:pPr>
+      <w:r>
+        <w:t>&lt;</w:t>
+      </w:r>
+      <w:proofErr w:type="gramStart"/>
+      <w:r>
+        <w:t>a  href</w:t>
+      </w:r>
+      <w:proofErr w:type="gramEnd"/>
+      <w:r>
+        <w:t>="jvo</w:t>
+      </w:r>
+      <w:proofErr w:type="gramStart"/>
+      <w:r>
+        <w:t>2506?</w:t>
+      </w:r>
+      <w:proofErr w:type="gramEnd"/>
+      <w:r>
+        <w:t>lang=</w:t>
+      </w:r>
+      <w:proofErr w:type="spellStart"/>
+      <w:r>
+        <w:t>fr&amp;iz</w:t>
+      </w:r>
+      <w:proofErr w:type="spellEnd"/>
+      <w:r>
+        <w:t xml:space="preserve">=12&amp;i=1553"&gt;Joannes Van </w:t>
+      </w:r>
+      <w:proofErr w:type="spellStart"/>
+      <w:r>
+        <w:t>Waelevelde</w:t>
+      </w:r>
+      <w:proofErr w:type="spellEnd"/>
+      <w:r>
+        <w:t>&lt;/a&gt;&lt;</w:t>
+      </w:r>
+      <w:proofErr w:type="spellStart"/>
+      <w:r>
+        <w:t>br</w:t>
+      </w:r>
+      <w:proofErr w:type="spellEnd"/>
+      <w:r>
+        <w:t>&gt;</w:t>
+      </w:r>
+    </w:p>
+    <w:p>
+      <w:pPr>
+        <w:pStyle w:val="Listing"/>
+      </w:pPr>
+      <w:r>
+        <w:t>&lt;/p&gt;</w:t>
+      </w:r>
+    </w:p>
+    <w:p>
+      <w:pPr>
+        <w:pStyle w:val="Listing"/>
+      </w:pPr>
+      <w:r>
+        <w:t>&lt;/td&gt;</w:t>
+      </w:r>
+    </w:p>
+    <w:p>
+      <w:pPr>
+        <w:pStyle w:val="Listing"/>
+      </w:pPr>
+      <w:r>
+        <w:t>&lt;/tr&gt;</w:t>
+      </w:r>
+    </w:p>
+    <w:p>
+      <w:pPr>
+        <w:pStyle w:val="Listing"/>
+      </w:pPr>
+      <w:r>
+        <w:t>&lt;</w:t>
+      </w:r>
+      <w:proofErr w:type="gramStart"/>
+      <w:r>
+        <w:t>tr</w:t>
+      </w:r>
+      <w:proofErr w:type="gramEnd"/>
+      <w:r>
+        <w:t>&gt;</w:t>
+      </w:r>
+    </w:p>
+    <w:p>
+      <w:pPr>
+        <w:pStyle w:val="Listing"/>
+      </w:pPr>
+      <w:r>
+        <w:t>&lt;</w:t>
+      </w:r>
+      <w:proofErr w:type="gramStart"/>
+      <w:r>
+        <w:t>td</w:t>
+      </w:r>
+      <w:proofErr w:type="gramEnd"/>
+      <w:r>
+        <w:t xml:space="preserve"> </w:t>
+      </w:r>
+      <w:proofErr w:type="spellStart"/>
+      <w:r>
+        <w:t>valign</w:t>
+      </w:r>
+      <w:proofErr w:type="spellEnd"/>
+      <w:r>
+        <w:t>="top" style="white-</w:t>
+      </w:r>
+      <w:proofErr w:type="spellStart"/>
+      <w:proofErr w:type="gramStart"/>
+      <w:r>
+        <w:t>space</w:t>
+      </w:r>
+      <w:proofErr w:type="spellEnd"/>
+      <w:r>
+        <w:t>:</w:t>
+      </w:r>
+      <w:proofErr w:type="gramEnd"/>
+      <w:r>
+        <w:t xml:space="preserve"> </w:t>
+      </w:r>
+      <w:proofErr w:type="spellStart"/>
+      <w:proofErr w:type="gramStart"/>
+      <w:r>
+        <w:t>nowrap</w:t>
+      </w:r>
+      <w:proofErr w:type="spellEnd"/>
+      <w:r>
+        <w:t>;</w:t>
+      </w:r>
+      <w:proofErr w:type="gramEnd"/>
+      <w:r>
+        <w:t xml:space="preserve">" </w:t>
+      </w:r>
+      <w:proofErr w:type="spellStart"/>
+      <w:r>
+        <w:t>width</w:t>
+      </w:r>
+      <w:proofErr w:type="spellEnd"/>
+      <w:r>
+        <w:t>="1"&gt;</w:t>
+      </w:r>
+    </w:p>
+    <w:p>
+      <w:pPr>
+        <w:pStyle w:val="Listing"/>
+      </w:pPr>
+      <w:r>
+        <w:t>&lt;</w:t>
+      </w:r>
+      <w:proofErr w:type="spellStart"/>
+      <w:proofErr w:type="gramStart"/>
+      <w:r>
+        <w:t>span</w:t>
+      </w:r>
+      <w:proofErr w:type="spellEnd"/>
+      <w:proofErr w:type="gramEnd"/>
+      <w:r>
+        <w:t xml:space="preserve"> class="</w:t>
+      </w:r>
+      <w:proofErr w:type="spellStart"/>
+      <w:r>
+        <w:t>ddate</w:t>
+      </w:r>
+      <w:proofErr w:type="spellEnd"/>
+      <w:r>
+        <w:t xml:space="preserve"> show-for-medium-up"&gt;25 avril 1781 :&lt;/</w:t>
+      </w:r>
+      <w:proofErr w:type="spellStart"/>
+      <w:r>
+        <w:t>span</w:t>
+      </w:r>
+      <w:proofErr w:type="spellEnd"/>
+      <w:r>
+        <w:t>&gt;</w:t>
+      </w:r>
+    </w:p>
+    <w:p>
+      <w:pPr>
+        <w:pStyle w:val="Listing"/>
+      </w:pPr>
+      <w:r>
+        <w:t>&lt;/td&gt;</w:t>
+      </w:r>
+    </w:p>
+    <w:p>
+      <w:pPr>
+        <w:pStyle w:val="Listing"/>
+      </w:pPr>
+      <w:r>
+        <w:t>&lt;</w:t>
+      </w:r>
+      <w:proofErr w:type="gramStart"/>
+      <w:r>
+        <w:t>td</w:t>
+      </w:r>
+      <w:proofErr w:type="gramEnd"/>
+      <w:r>
+        <w:t xml:space="preserve"> </w:t>
+      </w:r>
+      <w:proofErr w:type="spellStart"/>
+      <w:r>
+        <w:t>valign</w:t>
+      </w:r>
+      <w:proofErr w:type="spellEnd"/>
+      <w:r>
+        <w:t>="top"&gt;</w:t>
+      </w:r>
+    </w:p>
+    <w:p>
+      <w:pPr>
+        <w:pStyle w:val="Listing"/>
+      </w:pPr>
+      <w:r>
+        <w:t>&lt;</w:t>
+      </w:r>
+      <w:proofErr w:type="spellStart"/>
+      <w:proofErr w:type="gramStart"/>
+      <w:r>
+        <w:t>span</w:t>
+      </w:r>
+      <w:proofErr w:type="spellEnd"/>
+      <w:proofErr w:type="gramEnd"/>
+      <w:r>
+        <w:t xml:space="preserve"> class="</w:t>
+      </w:r>
+      <w:proofErr w:type="spellStart"/>
+      <w:r>
+        <w:t>ddate</w:t>
+      </w:r>
+      <w:proofErr w:type="spellEnd"/>
+      <w:r>
+        <w:t xml:space="preserve"> small-12 show-for-</w:t>
+      </w:r>
+      <w:proofErr w:type="spellStart"/>
+      <w:r>
+        <w:t>small</w:t>
+      </w:r>
+      <w:proofErr w:type="spellEnd"/>
+      <w:r>
+        <w:t>-</w:t>
+      </w:r>
+      <w:proofErr w:type="spellStart"/>
+      <w:r>
+        <w:t>only</w:t>
+      </w:r>
+      <w:proofErr w:type="spellEnd"/>
+      <w:r>
+        <w:t>" style="</w:t>
+      </w:r>
+      <w:proofErr w:type="spellStart"/>
+      <w:proofErr w:type="gramStart"/>
+      <w:r>
+        <w:t>float:none</w:t>
+      </w:r>
+      <w:proofErr w:type="spellEnd"/>
+      <w:proofErr w:type="gramEnd"/>
+      <w:r>
+        <w:t>; padding-</w:t>
+      </w:r>
+      <w:proofErr w:type="gramStart"/>
+      <w:r>
+        <w:t>top:</w:t>
+      </w:r>
+      <w:proofErr w:type="gramEnd"/>
+      <w:r>
+        <w:t>5</w:t>
+      </w:r>
+      <w:proofErr w:type="gramStart"/>
+      <w:r>
+        <w:t>px;</w:t>
+      </w:r>
+      <w:proofErr w:type="gramEnd"/>
+      <w:r>
+        <w:t>"&gt;25 avril 1781 :&lt;/</w:t>
+      </w:r>
+      <w:proofErr w:type="spellStart"/>
+      <w:r>
+        <w:t>span</w:t>
+      </w:r>
+      <w:proofErr w:type="spellEnd"/>
+      <w:r>
+        <w:t>&gt;</w:t>
+      </w:r>
+    </w:p>
+    <w:p>
+      <w:pPr>
+        <w:pStyle w:val="Listing"/>
+      </w:pPr>
+      <w:r>
+        <w:t>&lt;</w:t>
+      </w:r>
+      <w:proofErr w:type="spellStart"/>
+      <w:proofErr w:type="gramStart"/>
+      <w:r>
+        <w:t>span</w:t>
+      </w:r>
+      <w:proofErr w:type="spellEnd"/>
+      <w:proofErr w:type="gramEnd"/>
+      <w:r>
+        <w:t xml:space="preserve"> class="</w:t>
+      </w:r>
+      <w:proofErr w:type="spellStart"/>
+      <w:r>
+        <w:t>nnom</w:t>
+      </w:r>
+      <w:proofErr w:type="spellEnd"/>
+      <w:r>
+        <w:t>"&gt;</w:t>
+      </w:r>
+    </w:p>
+    <w:p>
+      <w:pPr>
+        <w:pStyle w:val="Listing"/>
+      </w:pPr>
+      <w:proofErr w:type="gramStart"/>
+      <w:r>
+        <w:t>Décès  -</w:t>
+      </w:r>
+      <w:proofErr w:type="gramEnd"/>
+      <w:r>
+        <w:t xml:space="preserve"> Moerbeke-Waas &lt;/</w:t>
+      </w:r>
+      <w:proofErr w:type="spellStart"/>
+      <w:r>
+        <w:t>span</w:t>
+      </w:r>
+      <w:proofErr w:type="spellEnd"/>
+      <w:r>
+        <w:t>&gt;</w:t>
+      </w:r>
+    </w:p>
+    <w:p>
+      <w:pPr>
+        <w:pStyle w:val="Listing"/>
+      </w:pPr>
+      <w:r>
+        <w:t>&lt;</w:t>
+      </w:r>
+      <w:proofErr w:type="spellStart"/>
+      <w:proofErr w:type="gramStart"/>
+      <w:r>
+        <w:t>br</w:t>
+      </w:r>
+      <w:proofErr w:type="spellEnd"/>
+      <w:proofErr w:type="gramEnd"/>
+      <w:r>
+        <w:t>&gt;</w:t>
+      </w:r>
+    </w:p>
+    <w:p>
+      <w:pPr>
+        <w:pStyle w:val="Listing"/>
+      </w:pPr>
+      <w:r>
+        <w:t>&lt;/td&gt;</w:t>
+      </w:r>
+    </w:p>
+    <w:p>
+      <w:pPr>
+        <w:pStyle w:val="Listing"/>
+      </w:pPr>
+      <w:r>
+        <w:t>&lt;/tr&gt;</w:t>
+      </w:r>
+    </w:p>
+    <w:p/>
+    <w:p>
+      <w:r>
+        <w:t>La partie en vert n’est pas exploitée !</w:t>
+      </w:r>
+      <w:r>
+        <w:t xml:space="preserve"> ==&gt; lecture </w:t>
+      </w:r>
+      <w:proofErr w:type="spellStart"/>
+      <w:r>
+        <w:t>event_notes_complementaires</w:t>
+      </w:r>
+      <w:proofErr w:type="spellEnd"/>
+    </w:p>
+    <w:p/>
+    <w:p/>
     <w:p/>
     <w:sectPr>
-      <w:headerReference w:type="default" r:id="rId20"/>
+      <w:headerReference w:type="default" r:id="rId27"/>
       <w:pgSz w:w="16838" w:h="11906" w:orient="landscape"/>
       <w:pgMar w:top="1080" w:right="1440" w:bottom="1080" w:left="1440" w:header="708" w:footer="708" w:gutter="0"/>
       <w:cols w:space="708"/>
@@ -3263,7 +6166,7 @@
       <w:rPr>
         <w:noProof/>
       </w:rPr>
-      <w:t>09/04/2025</w:t>
+      <w:t>12/04/2025</w:t>
     </w:r>
     <w:r>
       <w:fldChar w:fldCharType="end"/>
@@ -3715,6 +6618,118 @@
       <w:pPr>
         <w:ind w:left="6480" w:hanging="180"/>
       </w:pPr>
+    </w:lvl>
+  </w:abstractNum>
+  <w:abstractNum w:abstractNumId="4" w15:restartNumberingAfterBreak="0">
+    <w:nsid w:val="68DB6B0E"/>
+    <w:multiLevelType w:val="hybridMultilevel"/>
+    <w:tmpl w:val="FCAE502C"/>
+    <w:lvl w:ilvl="0" w:tplc="FF608A24">
+      <w:numFmt w:val="bullet"/>
+      <w:lvlText w:val=""/>
+      <w:lvlJc w:val="left"/>
+      <w:pPr>
+        <w:ind w:left="720" w:hanging="360"/>
+      </w:pPr>
+      <w:rPr>
+        <w:rFonts w:ascii="Symbol" w:eastAsiaTheme="minorHAnsi" w:hAnsi="Symbol" w:cstheme="minorBidi" w:hint="default"/>
+      </w:rPr>
+    </w:lvl>
+    <w:lvl w:ilvl="1" w:tplc="040C0003" w:tentative="1">
+      <w:start w:val="1"/>
+      <w:numFmt w:val="bullet"/>
+      <w:lvlText w:val="o"/>
+      <w:lvlJc w:val="left"/>
+      <w:pPr>
+        <w:ind w:left="1440" w:hanging="360"/>
+      </w:pPr>
+      <w:rPr>
+        <w:rFonts w:ascii="Courier New" w:hAnsi="Courier New" w:cs="Courier New" w:hint="default"/>
+      </w:rPr>
+    </w:lvl>
+    <w:lvl w:ilvl="2" w:tplc="040C0005" w:tentative="1">
+      <w:start w:val="1"/>
+      <w:numFmt w:val="bullet"/>
+      <w:lvlText w:val=""/>
+      <w:lvlJc w:val="left"/>
+      <w:pPr>
+        <w:ind w:left="2160" w:hanging="360"/>
+      </w:pPr>
+      <w:rPr>
+        <w:rFonts w:ascii="Wingdings" w:hAnsi="Wingdings" w:hint="default"/>
+      </w:rPr>
+    </w:lvl>
+    <w:lvl w:ilvl="3" w:tplc="040C0001" w:tentative="1">
+      <w:start w:val="1"/>
+      <w:numFmt w:val="bullet"/>
+      <w:lvlText w:val=""/>
+      <w:lvlJc w:val="left"/>
+      <w:pPr>
+        <w:ind w:left="2880" w:hanging="360"/>
+      </w:pPr>
+      <w:rPr>
+        <w:rFonts w:ascii="Symbol" w:hAnsi="Symbol" w:hint="default"/>
+      </w:rPr>
+    </w:lvl>
+    <w:lvl w:ilvl="4" w:tplc="040C0003" w:tentative="1">
+      <w:start w:val="1"/>
+      <w:numFmt w:val="bullet"/>
+      <w:lvlText w:val="o"/>
+      <w:lvlJc w:val="left"/>
+      <w:pPr>
+        <w:ind w:left="3600" w:hanging="360"/>
+      </w:pPr>
+      <w:rPr>
+        <w:rFonts w:ascii="Courier New" w:hAnsi="Courier New" w:cs="Courier New" w:hint="default"/>
+      </w:rPr>
+    </w:lvl>
+    <w:lvl w:ilvl="5" w:tplc="040C0005" w:tentative="1">
+      <w:start w:val="1"/>
+      <w:numFmt w:val="bullet"/>
+      <w:lvlText w:val=""/>
+      <w:lvlJc w:val="left"/>
+      <w:pPr>
+        <w:ind w:left="4320" w:hanging="360"/>
+      </w:pPr>
+      <w:rPr>
+        <w:rFonts w:ascii="Wingdings" w:hAnsi="Wingdings" w:hint="default"/>
+      </w:rPr>
+    </w:lvl>
+    <w:lvl w:ilvl="6" w:tplc="040C0001" w:tentative="1">
+      <w:start w:val="1"/>
+      <w:numFmt w:val="bullet"/>
+      <w:lvlText w:val=""/>
+      <w:lvlJc w:val="left"/>
+      <w:pPr>
+        <w:ind w:left="5040" w:hanging="360"/>
+      </w:pPr>
+      <w:rPr>
+        <w:rFonts w:ascii="Symbol" w:hAnsi="Symbol" w:hint="default"/>
+      </w:rPr>
+    </w:lvl>
+    <w:lvl w:ilvl="7" w:tplc="040C0003" w:tentative="1">
+      <w:start w:val="1"/>
+      <w:numFmt w:val="bullet"/>
+      <w:lvlText w:val="o"/>
+      <w:lvlJc w:val="left"/>
+      <w:pPr>
+        <w:ind w:left="5760" w:hanging="360"/>
+      </w:pPr>
+      <w:rPr>
+        <w:rFonts w:ascii="Courier New" w:hAnsi="Courier New" w:cs="Courier New" w:hint="default"/>
+      </w:rPr>
+    </w:lvl>
+    <w:lvl w:ilvl="8" w:tplc="040C0005" w:tentative="1">
+      <w:start w:val="1"/>
+      <w:numFmt w:val="bullet"/>
+      <w:lvlText w:val=""/>
+      <w:lvlJc w:val="left"/>
+      <w:pPr>
+        <w:ind w:left="6480" w:hanging="360"/>
+      </w:pPr>
+      <w:rPr>
+        <w:rFonts w:ascii="Wingdings" w:hAnsi="Wingdings" w:hint="default"/>
+      </w:rPr>
     </w:lvl>
   </w:abstractNum>
   <w:num w:numId="1" w16cid:durableId="1058437501">
@@ -3761,6 +6776,9 @@
   </w:num>
   <w:num w:numId="6" w16cid:durableId="1837961332">
     <w:abstractNumId w:val="1"/>
+  </w:num>
+  <w:num w:numId="7" w16cid:durableId="539979986">
+    <w:abstractNumId w:val="4"/>
   </w:num>
 </w:numbering>
 </file>

</xml_diff>

<commit_message>
Gestion des tags FAMS et FAMC
</commit_message>
<xml_diff>
--- a/doc/NotesNRa8_cas_particuliers.docx
+++ b/doc/NotesNRa8_cas_particuliers.docx
@@ -6083,8 +6083,262 @@
     <w:p/>
     <w:p/>
     <w:p/>
+    <w:p>
+      <w:r>
+        <w:t xml:space="preserve">Lors de la fusion : </w:t>
+      </w:r>
+      <w:r>
+        <w:t>pour :</w:t>
+      </w:r>
+    </w:p>
+    <w:p>
+      <w:r>
+        <w:t>https://gw.geneanet.org/jvo2506?lang=fr&amp;n=van+brussel&amp;oc=0&amp;p=eduardus # 55 personnes, 9 générations</w:t>
+      </w:r>
+    </w:p>
+    <w:p>
+      <w:r>
+        <w:t>https://gw.geneanet.org/sh1?lang=fr&amp;n=vermeulen&amp;oc=0&amp;p=anna+juliana # 51 personnes, 7 générations</w:t>
+      </w:r>
+    </w:p>
+    <w:p/>
+    <w:p>
+      <w:proofErr w:type="gramStart"/>
+      <w:r>
+        <w:t>d</w:t>
+      </w:r>
+      <w:r>
+        <w:t>es</w:t>
+      </w:r>
+      <w:proofErr w:type="gramEnd"/>
+      <w:r>
+        <w:t xml:space="preserve"> warnings de la forme :</w:t>
+      </w:r>
+    </w:p>
+    <w:p>
+      <w:r>
+        <w:lastRenderedPageBreak/>
+        <w:drawing>
+          <wp:inline distT="0" distB="0" distL="0" distR="0" wp14:anchorId="1E6A005E" wp14:editId="639CD0D1">
+            <wp:extent cx="6188710" cy="1242695"/>
+            <wp:effectExtent l="0" t="0" r="2540" b="0"/>
+            <wp:docPr id="1826450905" name="Image 1"/>
+            <wp:cNvGraphicFramePr>
+              <a:graphicFrameLocks xmlns:a="http://schemas.openxmlformats.org/drawingml/2006/main" noChangeAspect="1"/>
+            </wp:cNvGraphicFramePr>
+            <a:graphic xmlns:a="http://schemas.openxmlformats.org/drawingml/2006/main">
+              <a:graphicData uri="http://schemas.openxmlformats.org/drawingml/2006/picture">
+                <pic:pic xmlns:pic="http://schemas.openxmlformats.org/drawingml/2006/picture">
+                  <pic:nvPicPr>
+                    <pic:cNvPr id="1826450905" name=""/>
+                    <pic:cNvPicPr/>
+                  </pic:nvPicPr>
+                  <pic:blipFill>
+                    <a:blip r:embed="rId27"/>
+                    <a:stretch>
+                      <a:fillRect/>
+                    </a:stretch>
+                  </pic:blipFill>
+                  <pic:spPr>
+                    <a:xfrm>
+                      <a:off x="0" y="0"/>
+                      <a:ext cx="6188710" cy="1242695"/>
+                    </a:xfrm>
+                    <a:prstGeom prst="rect">
+                      <a:avLst/>
+                    </a:prstGeom>
+                  </pic:spPr>
+                </pic:pic>
+              </a:graphicData>
+            </a:graphic>
+          </wp:inline>
+        </w:drawing>
+      </w:r>
+    </w:p>
+    <w:p>
+      <w:r>
+        <w:t>Il s’agit de mariages</w:t>
+      </w:r>
+    </w:p>
+    <w:p>
+      <w:proofErr w:type="gramStart"/>
+      <w:r>
+        <w:t>lié</w:t>
+      </w:r>
+      <w:proofErr w:type="gramEnd"/>
+      <w:r>
+        <w:t xml:space="preserve"> à l’absence de balises FAMS et FAMC dans mes fichiers </w:t>
+      </w:r>
+      <w:proofErr w:type="spellStart"/>
+      <w:r>
+        <w:t>ged</w:t>
+      </w:r>
+      <w:proofErr w:type="spellEnd"/>
+      <w:r>
+        <w:t xml:space="preserve">, vs ceux reformatés par import </w:t>
+      </w:r>
+      <w:proofErr w:type="spellStart"/>
+      <w:r>
+        <w:t>Ancestris</w:t>
+      </w:r>
+      <w:proofErr w:type="spellEnd"/>
+      <w:r>
+        <w:t>.</w:t>
+      </w:r>
+    </w:p>
+    <w:p>
+      <w:pPr>
+        <w:pStyle w:val="Paragraphedeliste"/>
+        <w:numPr>
+          <w:ilvl w:val="0"/>
+          <w:numId w:val="8"/>
+        </w:numPr>
+      </w:pPr>
+      <w:proofErr w:type="gramStart"/>
+      <w:r>
+        <w:t>je</w:t>
+      </w:r>
+      <w:proofErr w:type="gramEnd"/>
+      <w:r>
+        <w:t xml:space="preserve"> corrige</w:t>
+      </w:r>
+    </w:p>
+    <w:p/>
+    <w:p>
+      <w:r>
+        <w:t xml:space="preserve">Il reste, pour </w:t>
+      </w:r>
+    </w:p>
+    <w:p>
+      <w:r>
+        <w:t>https://gw.geneanet.org/sh1?lang=fr&amp;n=vermeulen&amp;oc=0&amp;p=anna+juliana</w:t>
+      </w:r>
+    </w:p>
+    <w:p>
+      <w:proofErr w:type="gramStart"/>
+      <w:r>
+        <w:t>des</w:t>
+      </w:r>
+      <w:proofErr w:type="gramEnd"/>
+      <w:r>
+        <w:t xml:space="preserve"> warnings </w:t>
+      </w:r>
+    </w:p>
+    <w:p>
+      <w:r>
+        <w:drawing>
+          <wp:inline distT="0" distB="0" distL="0" distR="0" wp14:anchorId="4F9644ED" wp14:editId="61E1579B">
+            <wp:extent cx="5569607" cy="2061768"/>
+            <wp:effectExtent l="0" t="0" r="0" b="0"/>
+            <wp:docPr id="858926791" name="Image 1"/>
+            <wp:cNvGraphicFramePr>
+              <a:graphicFrameLocks xmlns:a="http://schemas.openxmlformats.org/drawingml/2006/main" noChangeAspect="1"/>
+            </wp:cNvGraphicFramePr>
+            <a:graphic xmlns:a="http://schemas.openxmlformats.org/drawingml/2006/main">
+              <a:graphicData uri="http://schemas.openxmlformats.org/drawingml/2006/picture">
+                <pic:pic xmlns:pic="http://schemas.openxmlformats.org/drawingml/2006/picture">
+                  <pic:nvPicPr>
+                    <pic:cNvPr id="858926791" name=""/>
+                    <pic:cNvPicPr/>
+                  </pic:nvPicPr>
+                  <pic:blipFill>
+                    <a:blip r:embed="rId28"/>
+                    <a:stretch>
+                      <a:fillRect/>
+                    </a:stretch>
+                  </pic:blipFill>
+                  <pic:spPr>
+                    <a:xfrm>
+                      <a:off x="0" y="0"/>
+                      <a:ext cx="5598290" cy="2072386"/>
+                    </a:xfrm>
+                    <a:prstGeom prst="rect">
+                      <a:avLst/>
+                    </a:prstGeom>
+                  </pic:spPr>
+                </pic:pic>
+              </a:graphicData>
+            </a:graphic>
+          </wp:inline>
+        </w:drawing>
+      </w:r>
+    </w:p>
+    <w:p/>
+    <w:p>
+      <w:r>
+        <w:t xml:space="preserve">Lignes KO dans le </w:t>
+      </w:r>
+      <w:proofErr w:type="spellStart"/>
+      <w:r>
+        <w:t>ged</w:t>
+      </w:r>
+      <w:proofErr w:type="spellEnd"/>
+      <w:r>
+        <w:t> :</w:t>
+      </w:r>
+    </w:p>
+    <w:p>
+      <w:pPr>
+        <w:pStyle w:val="Listing"/>
+      </w:pPr>
+      <w:r>
+        <w:t xml:space="preserve">2 NOTE </w:t>
+      </w:r>
+      <w:proofErr w:type="spellStart"/>
+      <w:r>
+        <w:t>Getuigen</w:t>
+      </w:r>
+      <w:proofErr w:type="spellEnd"/>
+      <w:r>
+        <w:t xml:space="preserve"> </w:t>
+      </w:r>
+      <w:proofErr w:type="spellStart"/>
+      <w:proofErr w:type="gramStart"/>
+      <w:r>
+        <w:t>huwelijksakte</w:t>
+      </w:r>
+      <w:proofErr w:type="spellEnd"/>
+      <w:r>
+        <w:t>:</w:t>
+      </w:r>
+      <w:proofErr w:type="gramEnd"/>
+    </w:p>
+    <w:p>
+      <w:pPr>
+        <w:pStyle w:val="Listing"/>
+      </w:pPr>
+      <w:r>
+        <w:t xml:space="preserve">- Petrus </w:t>
+      </w:r>
+      <w:proofErr w:type="spellStart"/>
+      <w:proofErr w:type="gramStart"/>
+      <w:r>
+        <w:t>Pooters</w:t>
+      </w:r>
+      <w:proofErr w:type="spellEnd"/>
+      <w:r>
+        <w:t>?</w:t>
+      </w:r>
+      <w:proofErr w:type="gramEnd"/>
+    </w:p>
+    <w:p>
+      <w:pPr>
+        <w:pStyle w:val="Listing"/>
+      </w:pPr>
+      <w:r>
+        <w:t>- Susanna De Backer</w:t>
+      </w:r>
+    </w:p>
+    <w:p/>
+    <w:p/>
+    <w:p/>
+    <w:p/>
+    <w:p/>
+    <w:p/>
+    <w:p/>
+    <w:p/>
     <w:sectPr>
-      <w:headerReference w:type="default" r:id="rId27"/>
+      <w:headerReference w:type="default" r:id="rId29"/>
       <w:pgSz w:w="16838" w:h="11906" w:orient="landscape"/>
       <w:pgMar w:top="1080" w:right="1440" w:bottom="1080" w:left="1440" w:header="708" w:footer="708" w:gutter="0"/>
       <w:cols w:space="708"/>
@@ -6299,6 +6553,118 @@
     </w:lvl>
   </w:abstractNum>
   <w:abstractNum w:abstractNumId="1" w15:restartNumberingAfterBreak="0">
+    <w:nsid w:val="1E50211D"/>
+    <w:multiLevelType w:val="hybridMultilevel"/>
+    <w:tmpl w:val="9ACC29FE"/>
+    <w:lvl w:ilvl="0" w:tplc="0CE056CE">
+      <w:numFmt w:val="bullet"/>
+      <w:lvlText w:val=""/>
+      <w:lvlJc w:val="left"/>
+      <w:pPr>
+        <w:ind w:left="765" w:hanging="405"/>
+      </w:pPr>
+      <w:rPr>
+        <w:rFonts w:ascii="Wingdings" w:eastAsiaTheme="minorHAnsi" w:hAnsi="Wingdings" w:cstheme="minorBidi" w:hint="default"/>
+      </w:rPr>
+    </w:lvl>
+    <w:lvl w:ilvl="1" w:tplc="040C0003" w:tentative="1">
+      <w:start w:val="1"/>
+      <w:numFmt w:val="bullet"/>
+      <w:lvlText w:val="o"/>
+      <w:lvlJc w:val="left"/>
+      <w:pPr>
+        <w:ind w:left="1440" w:hanging="360"/>
+      </w:pPr>
+      <w:rPr>
+        <w:rFonts w:ascii="Courier New" w:hAnsi="Courier New" w:cs="Courier New" w:hint="default"/>
+      </w:rPr>
+    </w:lvl>
+    <w:lvl w:ilvl="2" w:tplc="040C0005" w:tentative="1">
+      <w:start w:val="1"/>
+      <w:numFmt w:val="bullet"/>
+      <w:lvlText w:val=""/>
+      <w:lvlJc w:val="left"/>
+      <w:pPr>
+        <w:ind w:left="2160" w:hanging="360"/>
+      </w:pPr>
+      <w:rPr>
+        <w:rFonts w:ascii="Wingdings" w:hAnsi="Wingdings" w:hint="default"/>
+      </w:rPr>
+    </w:lvl>
+    <w:lvl w:ilvl="3" w:tplc="040C0001" w:tentative="1">
+      <w:start w:val="1"/>
+      <w:numFmt w:val="bullet"/>
+      <w:lvlText w:val=""/>
+      <w:lvlJc w:val="left"/>
+      <w:pPr>
+        <w:ind w:left="2880" w:hanging="360"/>
+      </w:pPr>
+      <w:rPr>
+        <w:rFonts w:ascii="Symbol" w:hAnsi="Symbol" w:hint="default"/>
+      </w:rPr>
+    </w:lvl>
+    <w:lvl w:ilvl="4" w:tplc="040C0003" w:tentative="1">
+      <w:start w:val="1"/>
+      <w:numFmt w:val="bullet"/>
+      <w:lvlText w:val="o"/>
+      <w:lvlJc w:val="left"/>
+      <w:pPr>
+        <w:ind w:left="3600" w:hanging="360"/>
+      </w:pPr>
+      <w:rPr>
+        <w:rFonts w:ascii="Courier New" w:hAnsi="Courier New" w:cs="Courier New" w:hint="default"/>
+      </w:rPr>
+    </w:lvl>
+    <w:lvl w:ilvl="5" w:tplc="040C0005" w:tentative="1">
+      <w:start w:val="1"/>
+      <w:numFmt w:val="bullet"/>
+      <w:lvlText w:val=""/>
+      <w:lvlJc w:val="left"/>
+      <w:pPr>
+        <w:ind w:left="4320" w:hanging="360"/>
+      </w:pPr>
+      <w:rPr>
+        <w:rFonts w:ascii="Wingdings" w:hAnsi="Wingdings" w:hint="default"/>
+      </w:rPr>
+    </w:lvl>
+    <w:lvl w:ilvl="6" w:tplc="040C0001" w:tentative="1">
+      <w:start w:val="1"/>
+      <w:numFmt w:val="bullet"/>
+      <w:lvlText w:val=""/>
+      <w:lvlJc w:val="left"/>
+      <w:pPr>
+        <w:ind w:left="5040" w:hanging="360"/>
+      </w:pPr>
+      <w:rPr>
+        <w:rFonts w:ascii="Symbol" w:hAnsi="Symbol" w:hint="default"/>
+      </w:rPr>
+    </w:lvl>
+    <w:lvl w:ilvl="7" w:tplc="040C0003" w:tentative="1">
+      <w:start w:val="1"/>
+      <w:numFmt w:val="bullet"/>
+      <w:lvlText w:val="o"/>
+      <w:lvlJc w:val="left"/>
+      <w:pPr>
+        <w:ind w:left="5760" w:hanging="360"/>
+      </w:pPr>
+      <w:rPr>
+        <w:rFonts w:ascii="Courier New" w:hAnsi="Courier New" w:cs="Courier New" w:hint="default"/>
+      </w:rPr>
+    </w:lvl>
+    <w:lvl w:ilvl="8" w:tplc="040C0005" w:tentative="1">
+      <w:start w:val="1"/>
+      <w:numFmt w:val="bullet"/>
+      <w:lvlText w:val=""/>
+      <w:lvlJc w:val="left"/>
+      <w:pPr>
+        <w:ind w:left="6480" w:hanging="360"/>
+      </w:pPr>
+      <w:rPr>
+        <w:rFonts w:ascii="Wingdings" w:hAnsi="Wingdings" w:hint="default"/>
+      </w:rPr>
+    </w:lvl>
+  </w:abstractNum>
+  <w:abstractNum w:abstractNumId="2" w15:restartNumberingAfterBreak="0">
     <w:nsid w:val="33A21272"/>
     <w:multiLevelType w:val="multilevel"/>
     <w:tmpl w:val="040C0025"/>
@@ -6421,7 +6787,7 @@
       </w:rPr>
     </w:lvl>
   </w:abstractNum>
-  <w:abstractNum w:abstractNumId="2" w15:restartNumberingAfterBreak="0">
+  <w:abstractNum w:abstractNumId="3" w15:restartNumberingAfterBreak="0">
     <w:nsid w:val="4DE17B69"/>
     <w:multiLevelType w:val="hybridMultilevel"/>
     <w:tmpl w:val="0608D544"/>
@@ -6534,7 +6900,7 @@
       </w:rPr>
     </w:lvl>
   </w:abstractNum>
-  <w:abstractNum w:abstractNumId="3" w15:restartNumberingAfterBreak="0">
+  <w:abstractNum w:abstractNumId="4" w15:restartNumberingAfterBreak="0">
     <w:nsid w:val="55282177"/>
     <w:multiLevelType w:val="hybridMultilevel"/>
     <w:tmpl w:val="4C36363E"/>
@@ -6620,7 +6986,7 @@
       </w:pPr>
     </w:lvl>
   </w:abstractNum>
-  <w:abstractNum w:abstractNumId="4" w15:restartNumberingAfterBreak="0">
+  <w:abstractNum w:abstractNumId="5" w15:restartNumberingAfterBreak="0">
     <w:nsid w:val="68DB6B0E"/>
     <w:multiLevelType w:val="hybridMultilevel"/>
     <w:tmpl w:val="FCAE502C"/>
@@ -6733,19 +7099,19 @@
     </w:lvl>
   </w:abstractNum>
   <w:num w:numId="1" w16cid:durableId="1058437501">
-    <w:abstractNumId w:val="3"/>
+    <w:abstractNumId w:val="4"/>
   </w:num>
   <w:num w:numId="2" w16cid:durableId="2007518373">
     <w:abstractNumId w:val="0"/>
   </w:num>
   <w:num w:numId="3" w16cid:durableId="1114131166">
+    <w:abstractNumId w:val="3"/>
+  </w:num>
+  <w:num w:numId="4" w16cid:durableId="1727877353">
     <w:abstractNumId w:val="2"/>
   </w:num>
-  <w:num w:numId="4" w16cid:durableId="1727877353">
-    <w:abstractNumId w:val="1"/>
-  </w:num>
   <w:num w:numId="5" w16cid:durableId="108859180">
-    <w:abstractNumId w:val="1"/>
+    <w:abstractNumId w:val="2"/>
     <w:lvlOverride w:ilvl="0">
       <w:startOverride w:val="1"/>
     </w:lvlOverride>
@@ -6775,10 +7141,13 @@
     </w:lvlOverride>
   </w:num>
   <w:num w:numId="6" w16cid:durableId="1837961332">
-    <w:abstractNumId w:val="1"/>
+    <w:abstractNumId w:val="2"/>
   </w:num>
   <w:num w:numId="7" w16cid:durableId="539979986">
-    <w:abstractNumId w:val="4"/>
+    <w:abstractNumId w:val="5"/>
+  </w:num>
+  <w:num w:numId="8" w16cid:durableId="288704122">
+    <w:abstractNumId w:val="1"/>
   </w:num>
 </w:numbering>
 </file>
@@ -7419,6 +7788,7 @@
   <w:style w:type="character" w:default="1" w:styleId="Policepardfaut">
     <w:name w:val="Default Paragraph Font"/>
     <w:uiPriority w:val="1"/>
+    <w:semiHidden/>
     <w:unhideWhenUsed/>
   </w:style>
   <w:style w:type="table" w:default="1" w:styleId="TableauNormal">

</xml_diff>